<commit_message>
TS 4.1 4.3 Kramam in progress
</commit_message>
<xml_diff>
--- a/TS-Kramam/TS-4.2/TS 4.2 Tamil Krama Paatam Corrections.docx
+++ b/TS-Kramam/TS-4.2/TS 4.2 Tamil Krama Paatam Corrections.docx
@@ -173,12 +173,16 @@
               <w:spacing w:before="0" w:line="240" w:lineRule="auto"/>
               <w:jc w:val="center"/>
               <w:rPr>
+                <w:b/>
+                <w:bCs/>
                 <w:sz w:val="32"/>
                 <w:szCs w:val="32"/>
               </w:rPr>
             </w:pPr>
             <w:r>
               <w:rPr>
+                <w:b/>
+                <w:bCs/>
                 <w:sz w:val="32"/>
                 <w:szCs w:val="32"/>
               </w:rPr>
@@ -190,12 +194,16 @@
               <w:spacing w:before="0" w:line="240" w:lineRule="auto"/>
               <w:jc w:val="center"/>
               <w:rPr>
+                <w:b/>
+                <w:bCs/>
                 <w:sz w:val="32"/>
                 <w:szCs w:val="32"/>
               </w:rPr>
             </w:pPr>
             <w:r>
               <w:rPr>
+                <w:b/>
+                <w:bCs/>
                 <w:sz w:val="32"/>
                 <w:szCs w:val="32"/>
               </w:rPr>
@@ -212,12 +220,16 @@
               <w:spacing w:before="0" w:line="240" w:lineRule="auto"/>
               <w:jc w:val="center"/>
               <w:rPr>
+                <w:b/>
+                <w:bCs/>
                 <w:sz w:val="32"/>
                 <w:szCs w:val="32"/>
               </w:rPr>
             </w:pPr>
             <w:r>
               <w:rPr>
+                <w:b/>
+                <w:bCs/>
                 <w:sz w:val="32"/>
                 <w:szCs w:val="32"/>
               </w:rPr>
@@ -235,12 +247,16 @@
               <w:ind w:right="-18"/>
               <w:jc w:val="center"/>
               <w:rPr>
+                <w:b/>
+                <w:bCs/>
                 <w:sz w:val="32"/>
                 <w:szCs w:val="32"/>
               </w:rPr>
             </w:pPr>
             <w:r>
               <w:rPr>
+                <w:b/>
+                <w:bCs/>
                 <w:sz w:val="32"/>
                 <w:szCs w:val="32"/>
               </w:rPr>
@@ -942,42 +958,6 @@
         </w:rPr>
         <w:t>==========</w:t>
       </w:r>
-    </w:p>
-    <w:p>
-      <w:pPr>
-        <w:jc w:val="center"/>
-        <w:rPr>
-          <w:b/>
-          <w:bCs/>
-          <w:sz w:val="32"/>
-          <w:szCs w:val="32"/>
-          <w:u w:val="single"/>
-        </w:rPr>
-      </w:pPr>
-    </w:p>
-    <w:p>
-      <w:pPr>
-        <w:jc w:val="center"/>
-        <w:rPr>
-          <w:b/>
-          <w:bCs/>
-          <w:sz w:val="32"/>
-          <w:szCs w:val="32"/>
-          <w:u w:val="single"/>
-        </w:rPr>
-      </w:pPr>
-    </w:p>
-    <w:p>
-      <w:pPr>
-        <w:jc w:val="center"/>
-        <w:rPr>
-          <w:b/>
-          <w:bCs/>
-          <w:sz w:val="32"/>
-          <w:szCs w:val="32"/>
-          <w:u w:val="single"/>
-        </w:rPr>
-      </w:pPr>
     </w:p>
     <w:p>
       <w:pPr>
@@ -1972,6 +1952,9 @@
     </w:tbl>
     <w:p>
       <w:pPr>
+        <w:pBdr>
+          <w:bottom w:val="double" w:sz="6" w:space="1" w:color="auto"/>
+        </w:pBdr>
         <w:jc w:val="center"/>
         <w:rPr>
           <w:b/>
@@ -1981,7 +1964,10 @@
           <w:u w:val="single"/>
         </w:rPr>
       </w:pPr>
-      <w:r>
+    </w:p>
+    <w:p>
+      <w:pPr>
+        <w:jc w:val="center"/>
         <w:rPr>
           <w:b/>
           <w:bCs/>
@@ -1989,8 +1975,31 @@
           <w:szCs w:val="32"/>
           <w:u w:val="single"/>
         </w:rPr>
-        <w:t>=========</w:t>
-      </w:r>
+      </w:pPr>
+    </w:p>
+    <w:p>
+      <w:pPr>
+        <w:jc w:val="center"/>
+        <w:rPr>
+          <w:b/>
+          <w:bCs/>
+          <w:sz w:val="32"/>
+          <w:szCs w:val="32"/>
+          <w:u w:val="single"/>
+        </w:rPr>
+      </w:pPr>
+    </w:p>
+    <w:p>
+      <w:pPr>
+        <w:jc w:val="center"/>
+        <w:rPr>
+          <w:b/>
+          <w:bCs/>
+          <w:sz w:val="32"/>
+          <w:szCs w:val="32"/>
+          <w:u w:val="single"/>
+        </w:rPr>
+      </w:pPr>
     </w:p>
     <w:p>
       <w:pPr>
@@ -2011,6 +2020,7 @@
           <w:szCs w:val="32"/>
           <w:u w:val="single"/>
         </w:rPr>
+        <w:lastRenderedPageBreak/>
         <w:t xml:space="preserve">TS </w:t>
       </w:r>
       <w:r>
@@ -2108,7 +2118,6 @@
           <w:b/>
           <w:bCs/>
         </w:rPr>
-        <w:lastRenderedPageBreak/>
         <w:t>(ignore those which are already incorporated in your book’s version and date)</w:t>
       </w:r>
     </w:p>
@@ -6627,7 +6636,23 @@
                 <w:b/>
                 <w:bCs/>
               </w:rPr>
-              <w:t>ma vaakyam was omitted by mistake</w:t>
+              <w:t xml:space="preserve">ma </w:t>
+            </w:r>
+            <w:proofErr w:type="spellStart"/>
+            <w:r>
+              <w:rPr>
+                <w:b/>
+                <w:bCs/>
+              </w:rPr>
+              <w:t>vaakyam</w:t>
+            </w:r>
+            <w:proofErr w:type="spellEnd"/>
+            <w:r>
+              <w:rPr>
+                <w:b/>
+                <w:bCs/>
+              </w:rPr>
+              <w:t xml:space="preserve"> was omitted by mistake</w:t>
             </w:r>
             <w:r>
               <w:rPr>
@@ -10481,14 +10506,35 @@
         <w:bCs/>
       </w:rPr>
       <w:tab/>
-      <w:t xml:space="preserve">              v</w:t>
+      <w:t xml:space="preserve">              </w:t>
     </w:r>
     <w:r>
       <w:rPr>
         <w:b/>
         <w:bCs/>
       </w:rPr>
-      <w:t>edavms@gmail.com</w:t>
+      <w:t>www.</w:t>
+    </w:r>
+    <w:r>
+      <w:rPr>
+        <w:b/>
+        <w:bCs/>
+      </w:rPr>
+      <w:t>v</w:t>
+    </w:r>
+    <w:r>
+      <w:rPr>
+        <w:b/>
+        <w:bCs/>
+      </w:rPr>
+      <w:t>edavms</w:t>
+    </w:r>
+    <w:r>
+      <w:rPr>
+        <w:b/>
+        <w:bCs/>
+      </w:rPr>
+      <w:t>.in</w:t>
     </w:r>
     <w:r>
       <w:rPr>
@@ -10507,6 +10553,9 @@
     </w:r>
     <w:r>
       <w:tab/>
+    </w:r>
+    <w:r>
+      <w:t xml:space="preserve">                           </w:t>
     </w:r>
     <w:r>
       <w:tab/>

</xml_diff>

<commit_message>
TS 4.2 Kramam Tamil Sanskrit Correction
</commit_message>
<xml_diff>
--- a/TS-Kramam/TS-4.2/TS 4.2 Tamil Krama Paatam Corrections.docx
+++ b/TS-Kramam/TS-4.2/TS 4.2 Tamil Krama Paatam Corrections.docx
@@ -300,6 +300,3133 @@
                 <w:sz w:val="28"/>
                 <w:szCs w:val="32"/>
               </w:rPr>
+              <w:t>T.S.</w:t>
+            </w:r>
+            <w:r>
+              <w:rPr>
+                <w:rFonts w:cs="Arial"/>
+                <w:b/>
+                <w:color w:val="000000"/>
+                <w:sz w:val="28"/>
+                <w:szCs w:val="32"/>
+              </w:rPr>
+              <w:t>4.2.</w:t>
+            </w:r>
+            <w:r>
+              <w:rPr>
+                <w:rFonts w:cs="Arial"/>
+                <w:b/>
+                <w:color w:val="000000"/>
+                <w:sz w:val="28"/>
+                <w:szCs w:val="32"/>
+              </w:rPr>
+              <w:t>5</w:t>
+            </w:r>
+            <w:r>
+              <w:rPr>
+                <w:rFonts w:cs="Arial"/>
+                <w:b/>
+                <w:color w:val="000000"/>
+                <w:sz w:val="28"/>
+                <w:szCs w:val="32"/>
+              </w:rPr>
+              <w:t>.</w:t>
+            </w:r>
+            <w:r>
+              <w:rPr>
+                <w:rFonts w:cs="Arial"/>
+                <w:b/>
+                <w:color w:val="000000"/>
+                <w:sz w:val="28"/>
+                <w:szCs w:val="32"/>
+              </w:rPr>
+              <w:t>4</w:t>
+            </w:r>
+            <w:r>
+              <w:rPr>
+                <w:rFonts w:cs="Arial"/>
+                <w:b/>
+                <w:color w:val="000000"/>
+                <w:sz w:val="28"/>
+                <w:szCs w:val="32"/>
+              </w:rPr>
+              <w:t xml:space="preserve"> </w:t>
+            </w:r>
+            <w:r>
+              <w:rPr>
+                <w:rFonts w:cs="Arial"/>
+                <w:b/>
+                <w:color w:val="000000"/>
+                <w:sz w:val="28"/>
+                <w:szCs w:val="32"/>
+              </w:rPr>
+              <w:t>– Kramam</w:t>
+            </w:r>
+          </w:p>
+          <w:p>
+            <w:pPr>
+              <w:widowControl w:val="0"/>
+              <w:tabs>
+                <w:tab w:val="left" w:pos="993"/>
+              </w:tabs>
+              <w:autoSpaceDE w:val="0"/>
+              <w:autoSpaceDN w:val="0"/>
+              <w:adjustRightInd w:val="0"/>
+              <w:spacing w:before="0" w:line="240" w:lineRule="auto"/>
+              <w:ind w:right="297"/>
+              <w:rPr>
+                <w:rFonts w:cs="Arial"/>
+                <w:b/>
+                <w:color w:val="000000"/>
+                <w:sz w:val="28"/>
+                <w:szCs w:val="32"/>
+              </w:rPr>
+            </w:pPr>
+            <w:r>
+              <w:rPr>
+                <w:rFonts w:cs="Arial"/>
+                <w:b/>
+                <w:color w:val="000000"/>
+                <w:sz w:val="28"/>
+                <w:szCs w:val="32"/>
+              </w:rPr>
+              <w:t xml:space="preserve">Krama Vaakyam No. - </w:t>
+            </w:r>
+            <w:r>
+              <w:rPr>
+                <w:rFonts w:cs="Arial"/>
+                <w:b/>
+                <w:color w:val="000000"/>
+                <w:sz w:val="28"/>
+                <w:szCs w:val="32"/>
+              </w:rPr>
+              <w:t>26</w:t>
+            </w:r>
+          </w:p>
+          <w:p>
+            <w:pPr>
+              <w:widowControl w:val="0"/>
+              <w:tabs>
+                <w:tab w:val="left" w:pos="993"/>
+              </w:tabs>
+              <w:autoSpaceDE w:val="0"/>
+              <w:autoSpaceDN w:val="0"/>
+              <w:adjustRightInd w:val="0"/>
+              <w:spacing w:before="0" w:line="240" w:lineRule="auto"/>
+              <w:ind w:right="297"/>
+              <w:rPr>
+                <w:rFonts w:cs="Arial"/>
+                <w:b/>
+                <w:color w:val="000000"/>
+                <w:sz w:val="28"/>
+                <w:szCs w:val="32"/>
+              </w:rPr>
+            </w:pPr>
+            <w:r>
+              <w:rPr>
+                <w:rFonts w:cs="Arial"/>
+                <w:b/>
+                <w:color w:val="000000"/>
+                <w:sz w:val="28"/>
+                <w:szCs w:val="32"/>
+              </w:rPr>
+              <w:t>Panchaati No</w:t>
+            </w:r>
+            <w:r>
+              <w:rPr>
+                <w:rFonts w:cs="Arial"/>
+                <w:b/>
+                <w:color w:val="000000"/>
+                <w:szCs w:val="32"/>
+              </w:rPr>
+              <w:t>. -</w:t>
+            </w:r>
+            <w:r>
+              <w:rPr>
+                <w:rFonts w:cs="Arial"/>
+                <w:b/>
+                <w:color w:val="000000"/>
+                <w:sz w:val="28"/>
+                <w:szCs w:val="28"/>
+              </w:rPr>
+              <w:t xml:space="preserve"> </w:t>
+            </w:r>
+            <w:r>
+              <w:rPr>
+                <w:rFonts w:cs="Arial"/>
+                <w:b/>
+                <w:color w:val="000000"/>
+                <w:sz w:val="28"/>
+                <w:szCs w:val="28"/>
+              </w:rPr>
+              <w:t>21</w:t>
+            </w:r>
+          </w:p>
+        </w:tc>
+        <w:tc>
+          <w:tcPr>
+            <w:tcW w:w="5103" w:type="dxa"/>
+          </w:tcPr>
+          <w:p>
+            <w:pPr>
+              <w:widowControl w:val="0"/>
+              <w:autoSpaceDE w:val="0"/>
+              <w:autoSpaceDN w:val="0"/>
+              <w:adjustRightInd w:val="0"/>
+              <w:spacing w:before="0" w:line="240" w:lineRule="auto"/>
+              <w:rPr>
+                <w:rFonts w:ascii="Latha" w:hAnsi="Latha" w:cs="Latha"/>
+                <w:sz w:val="28"/>
+                <w:szCs w:val="28"/>
+                <w:cs/>
+                <w:lang w:bidi="ta-IN"/>
+              </w:rPr>
+            </w:pPr>
+            <w:r>
+              <w:rPr>
+                <w:rFonts w:ascii="Latha" w:hAnsi="Latha" w:cs="Latha"/>
+                <w:sz w:val="28"/>
+                <w:szCs w:val="28"/>
+                <w:cs/>
+                <w:lang w:bidi="ta-IN"/>
+              </w:rPr>
+              <w:t>துப்</w:t>
+            </w:r>
+            <w:r>
+              <w:rPr>
+                <w:rFonts w:ascii="Latha" w:hAnsi="Latha" w:cs="Latha"/>
+                <w:b/>
+                <w:bCs/>
+                <w:position w:val="-12"/>
+                <w:sz w:val="28"/>
+                <w:szCs w:val="28"/>
+                <w:cs/>
+                <w:lang w:bidi="ta-IN"/>
+              </w:rPr>
+              <w:t>4</w:t>
+            </w:r>
+            <w:r>
+              <w:rPr>
+                <w:rFonts w:ascii="Latha" w:hAnsi="Latha" w:cs="Latha"/>
+                <w:sz w:val="28"/>
+                <w:szCs w:val="28"/>
+                <w:cs/>
+                <w:lang w:bidi="ta-IN"/>
+              </w:rPr>
+              <w:t>ய</w:t>
+            </w:r>
+            <w:r>
+              <w:rPr>
+                <w:rFonts w:ascii="BRH Tamil Tab Extra" w:hAnsi="BRH Tamil Tab Extra" w:cs="Latha"/>
+                <w:b/>
+                <w:sz w:val="36"/>
+                <w:szCs w:val="28"/>
+                <w:lang w:bidi="ta-IN"/>
+              </w:rPr>
+              <w:t>†</w:t>
+            </w:r>
+            <w:r>
+              <w:rPr>
+                <w:rFonts w:ascii="Latha" w:hAnsi="Latha" w:cs="Latha"/>
+                <w:sz w:val="28"/>
+                <w:szCs w:val="28"/>
+                <w:cs/>
+                <w:lang w:bidi="ta-IN"/>
+              </w:rPr>
+              <w:t>மஸ்து</w:t>
+            </w:r>
+            <w:r>
+              <w:rPr>
+                <w:rFonts w:ascii="Latha" w:hAnsi="Latha" w:cs="Latha"/>
+                <w:sz w:val="28"/>
+                <w:szCs w:val="28"/>
+                <w:lang w:bidi="ta-IN"/>
+              </w:rPr>
+              <w:t xml:space="preserve"> |</w:t>
+            </w:r>
+            <w:r>
+              <w:rPr>
+                <w:rFonts w:ascii="Latha" w:hAnsi="Latha" w:cs="Latha"/>
+                <w:sz w:val="28"/>
+                <w:szCs w:val="28"/>
+                <w:lang w:bidi="ta-IN"/>
+              </w:rPr>
+              <w:t xml:space="preserve"> </w:t>
+            </w:r>
+            <w:r>
+              <w:rPr>
+                <w:rFonts w:ascii="Latha" w:hAnsi="Latha" w:cs="Latha"/>
+                <w:sz w:val="28"/>
+                <w:szCs w:val="28"/>
+                <w:lang w:bidi="ta-IN"/>
+              </w:rPr>
+              <w:br/>
+            </w:r>
+            <w:r>
+              <w:rPr>
+                <w:rFonts w:ascii="Latha" w:hAnsi="Latha" w:cs="Latha"/>
+                <w:sz w:val="28"/>
+                <w:szCs w:val="28"/>
+                <w:cs/>
+                <w:lang w:bidi="ta-IN"/>
+              </w:rPr>
+              <w:t>அ</w:t>
+            </w:r>
+            <w:r>
+              <w:rPr>
+                <w:rFonts w:ascii="BRH Tamil Tab Extra" w:hAnsi="BRH Tamil Tab Extra" w:cs="Latha"/>
+                <w:b/>
+                <w:sz w:val="36"/>
+                <w:szCs w:val="28"/>
+                <w:lang w:bidi="ta-IN"/>
+              </w:rPr>
+              <w:t>…</w:t>
+            </w:r>
+            <w:r>
+              <w:rPr>
+                <w:rFonts w:ascii="Latha" w:hAnsi="Latha" w:cs="Latha"/>
+                <w:sz w:val="28"/>
+                <w:szCs w:val="28"/>
+                <w:cs/>
+                <w:lang w:bidi="ta-IN"/>
+              </w:rPr>
+              <w:t>ஸ்த்</w:t>
+            </w:r>
+            <w:r>
+              <w:rPr>
+                <w:rFonts w:ascii="Latha" w:hAnsi="Latha" w:cs="Latha"/>
+                <w:sz w:val="28"/>
+                <w:szCs w:val="28"/>
+                <w:highlight w:val="yellow"/>
+                <w:cs/>
+                <w:lang w:bidi="ta-IN"/>
+              </w:rPr>
+              <w:t>விய</w:t>
+            </w:r>
+            <w:r>
+              <w:rPr>
+                <w:rFonts w:ascii="BRH Tamil Tab Extra" w:hAnsi="BRH Tamil Tab Extra" w:cs="Latha"/>
+                <w:b/>
+                <w:sz w:val="36"/>
+                <w:szCs w:val="28"/>
+                <w:highlight w:val="yellow"/>
+                <w:lang w:bidi="ta-IN"/>
+              </w:rPr>
+              <w:t>†</w:t>
+            </w:r>
+            <w:r>
+              <w:rPr>
+                <w:rFonts w:ascii="Latha" w:hAnsi="Latha" w:cs="Latha"/>
+                <w:sz w:val="28"/>
+                <w:szCs w:val="28"/>
+                <w:cs/>
+                <w:lang w:bidi="ta-IN"/>
+              </w:rPr>
+              <w:t>ஸ்து</w:t>
+            </w:r>
+            <w:r>
+              <w:rPr>
+                <w:rFonts w:ascii="Latha" w:hAnsi="Latha" w:cs="Latha"/>
+                <w:sz w:val="28"/>
+                <w:szCs w:val="28"/>
+                <w:lang w:bidi="ta-IN"/>
+              </w:rPr>
+              <w:t xml:space="preserve"> ||</w:t>
+            </w:r>
+          </w:p>
+        </w:tc>
+        <w:tc>
+          <w:tcPr>
+            <w:tcW w:w="5386" w:type="dxa"/>
+          </w:tcPr>
+          <w:p>
+            <w:pPr>
+              <w:widowControl w:val="0"/>
+              <w:autoSpaceDE w:val="0"/>
+              <w:autoSpaceDN w:val="0"/>
+              <w:adjustRightInd w:val="0"/>
+              <w:spacing w:before="0" w:line="240" w:lineRule="auto"/>
+              <w:rPr>
+                <w:rFonts w:ascii="Latha" w:hAnsi="Latha" w:cs="Latha"/>
+                <w:sz w:val="28"/>
+                <w:szCs w:val="28"/>
+                <w:lang w:bidi="ta-IN"/>
+              </w:rPr>
+            </w:pPr>
+            <w:r>
+              <w:rPr>
+                <w:rFonts w:ascii="Latha" w:hAnsi="Latha" w:cs="Latha"/>
+                <w:sz w:val="28"/>
+                <w:szCs w:val="28"/>
+                <w:cs/>
+                <w:lang w:bidi="ta-IN"/>
+              </w:rPr>
+              <w:t>துப்</w:t>
+            </w:r>
+            <w:r>
+              <w:rPr>
+                <w:rFonts w:ascii="Latha" w:hAnsi="Latha" w:cs="Latha"/>
+                <w:b/>
+                <w:bCs/>
+                <w:position w:val="-12"/>
+                <w:sz w:val="28"/>
+                <w:szCs w:val="28"/>
+                <w:cs/>
+                <w:lang w:bidi="ta-IN"/>
+              </w:rPr>
+              <w:t>4</w:t>
+            </w:r>
+            <w:r>
+              <w:rPr>
+                <w:rFonts w:ascii="Latha" w:hAnsi="Latha" w:cs="Latha"/>
+                <w:sz w:val="28"/>
+                <w:szCs w:val="28"/>
+                <w:cs/>
+                <w:lang w:bidi="ta-IN"/>
+              </w:rPr>
+              <w:t>ய</w:t>
+            </w:r>
+            <w:r>
+              <w:rPr>
+                <w:rFonts w:ascii="BRH Tamil Tab Extra" w:hAnsi="BRH Tamil Tab Extra" w:cs="Latha"/>
+                <w:b/>
+                <w:sz w:val="36"/>
+                <w:szCs w:val="28"/>
+                <w:lang w:bidi="ta-IN"/>
+              </w:rPr>
+              <w:t>†</w:t>
+            </w:r>
+            <w:r>
+              <w:rPr>
+                <w:rFonts w:ascii="Latha" w:hAnsi="Latha" w:cs="Latha"/>
+                <w:sz w:val="28"/>
+                <w:szCs w:val="28"/>
+                <w:cs/>
+                <w:lang w:bidi="ta-IN"/>
+              </w:rPr>
+              <w:t>மஸ்து</w:t>
+            </w:r>
+            <w:r>
+              <w:rPr>
+                <w:rFonts w:ascii="Latha" w:hAnsi="Latha" w:cs="Latha"/>
+                <w:sz w:val="28"/>
+                <w:szCs w:val="28"/>
+                <w:lang w:bidi="ta-IN"/>
+              </w:rPr>
+              <w:t xml:space="preserve"> |</w:t>
+            </w:r>
+          </w:p>
+          <w:p>
+            <w:pPr>
+              <w:widowControl w:val="0"/>
+              <w:autoSpaceDE w:val="0"/>
+              <w:autoSpaceDN w:val="0"/>
+              <w:adjustRightInd w:val="0"/>
+              <w:spacing w:before="0" w:line="240" w:lineRule="auto"/>
+              <w:rPr>
+                <w:rFonts w:ascii="Latha" w:hAnsi="Latha" w:cs="Latha"/>
+                <w:sz w:val="28"/>
+                <w:szCs w:val="28"/>
+                <w:cs/>
+                <w:lang w:bidi="ta-IN"/>
+              </w:rPr>
+            </w:pPr>
+            <w:r>
+              <w:rPr>
+                <w:rFonts w:ascii="Latha" w:hAnsi="Latha" w:cs="Latha"/>
+                <w:sz w:val="28"/>
+                <w:szCs w:val="28"/>
+                <w:cs/>
+                <w:lang w:bidi="ta-IN"/>
+              </w:rPr>
+              <w:t>அ</w:t>
+            </w:r>
+            <w:r>
+              <w:rPr>
+                <w:rFonts w:ascii="BRH Tamil Tab Extra" w:hAnsi="BRH Tamil Tab Extra" w:cs="Latha"/>
+                <w:b/>
+                <w:sz w:val="36"/>
+                <w:szCs w:val="28"/>
+                <w:lang w:bidi="ta-IN"/>
+              </w:rPr>
+              <w:t>…</w:t>
+            </w:r>
+            <w:r>
+              <w:rPr>
+                <w:rFonts w:ascii="Latha" w:hAnsi="Latha" w:cs="Latha"/>
+                <w:sz w:val="28"/>
+                <w:szCs w:val="28"/>
+                <w:cs/>
+                <w:lang w:bidi="ta-IN"/>
+              </w:rPr>
+              <w:t>ஸ்த்வி</w:t>
+            </w:r>
+            <w:r>
+              <w:rPr>
+                <w:rFonts w:ascii="Latha" w:hAnsi="Latha" w:cs="Latha"/>
+                <w:sz w:val="28"/>
+                <w:szCs w:val="28"/>
+                <w:highlight w:val="green"/>
+                <w:cs/>
+                <w:lang w:bidi="ta-IN"/>
+              </w:rPr>
+              <w:t>த்</w:t>
+            </w:r>
+            <w:r>
+              <w:rPr>
+                <w:rFonts w:ascii="Latha" w:hAnsi="Latha" w:cs="Latha"/>
+                <w:sz w:val="28"/>
+                <w:szCs w:val="28"/>
+                <w:cs/>
+                <w:lang w:bidi="ta-IN"/>
+              </w:rPr>
+              <w:t>ய</w:t>
+            </w:r>
+            <w:r>
+              <w:rPr>
+                <w:rFonts w:ascii="BRH Tamil Tab Extra" w:hAnsi="BRH Tamil Tab Extra" w:cs="Latha"/>
+                <w:b/>
+                <w:sz w:val="36"/>
+                <w:szCs w:val="28"/>
+                <w:lang w:bidi="ta-IN"/>
+              </w:rPr>
+              <w:t>†</w:t>
+            </w:r>
+            <w:r>
+              <w:rPr>
+                <w:rFonts w:ascii="Latha" w:hAnsi="Latha" w:cs="Latha"/>
+                <w:sz w:val="28"/>
+                <w:szCs w:val="28"/>
+                <w:cs/>
+                <w:lang w:bidi="ta-IN"/>
+              </w:rPr>
+              <w:t>ஸ்து</w:t>
+            </w:r>
+            <w:r>
+              <w:rPr>
+                <w:rFonts w:ascii="Latha" w:hAnsi="Latha" w:cs="Latha"/>
+                <w:sz w:val="28"/>
+                <w:szCs w:val="28"/>
+                <w:lang w:bidi="ta-IN"/>
+              </w:rPr>
+              <w:t xml:space="preserve"> ||</w:t>
+            </w:r>
+          </w:p>
+        </w:tc>
+      </w:tr>
+      <w:tr>
+        <w:trPr>
+          <w:trHeight w:val="1104"/>
+        </w:trPr>
+        <w:tc>
+          <w:tcPr>
+            <w:tcW w:w="3974" w:type="dxa"/>
+          </w:tcPr>
+          <w:p>
+            <w:pPr>
+              <w:widowControl w:val="0"/>
+              <w:tabs>
+                <w:tab w:val="left" w:pos="993"/>
+              </w:tabs>
+              <w:autoSpaceDE w:val="0"/>
+              <w:autoSpaceDN w:val="0"/>
+              <w:adjustRightInd w:val="0"/>
+              <w:spacing w:before="0" w:line="240" w:lineRule="auto"/>
+              <w:ind w:right="297"/>
+              <w:rPr>
+                <w:rFonts w:cs="Arial"/>
+                <w:b/>
+                <w:color w:val="000000"/>
+                <w:sz w:val="28"/>
+                <w:szCs w:val="32"/>
+              </w:rPr>
+            </w:pPr>
+            <w:r>
+              <w:rPr>
+                <w:rFonts w:cs="Arial"/>
+                <w:b/>
+                <w:color w:val="000000"/>
+                <w:sz w:val="28"/>
+                <w:szCs w:val="32"/>
+              </w:rPr>
+              <w:t>T.S.</w:t>
+            </w:r>
+            <w:r>
+              <w:rPr>
+                <w:rFonts w:cs="Arial"/>
+                <w:b/>
+                <w:color w:val="000000"/>
+                <w:sz w:val="28"/>
+                <w:szCs w:val="32"/>
+              </w:rPr>
+              <w:t>4.2.</w:t>
+            </w:r>
+            <w:r>
+              <w:rPr>
+                <w:rFonts w:cs="Arial"/>
+                <w:b/>
+                <w:color w:val="000000"/>
+                <w:sz w:val="28"/>
+                <w:szCs w:val="32"/>
+              </w:rPr>
+              <w:t>7</w:t>
+            </w:r>
+            <w:r>
+              <w:rPr>
+                <w:rFonts w:cs="Arial"/>
+                <w:b/>
+                <w:color w:val="000000"/>
+                <w:sz w:val="28"/>
+                <w:szCs w:val="32"/>
+              </w:rPr>
+              <w:t>.</w:t>
+            </w:r>
+            <w:r>
+              <w:rPr>
+                <w:rFonts w:cs="Arial"/>
+                <w:b/>
+                <w:color w:val="000000"/>
+                <w:sz w:val="28"/>
+                <w:szCs w:val="32"/>
+              </w:rPr>
+              <w:t>1</w:t>
+            </w:r>
+            <w:r>
+              <w:rPr>
+                <w:rFonts w:cs="Arial"/>
+                <w:b/>
+                <w:color w:val="000000"/>
+                <w:sz w:val="28"/>
+                <w:szCs w:val="32"/>
+              </w:rPr>
+              <w:t xml:space="preserve"> </w:t>
+            </w:r>
+            <w:r>
+              <w:rPr>
+                <w:rFonts w:cs="Arial"/>
+                <w:b/>
+                <w:color w:val="000000"/>
+                <w:sz w:val="28"/>
+                <w:szCs w:val="32"/>
+              </w:rPr>
+              <w:t>– Kramam</w:t>
+            </w:r>
+          </w:p>
+          <w:p>
+            <w:pPr>
+              <w:widowControl w:val="0"/>
+              <w:tabs>
+                <w:tab w:val="left" w:pos="993"/>
+              </w:tabs>
+              <w:autoSpaceDE w:val="0"/>
+              <w:autoSpaceDN w:val="0"/>
+              <w:adjustRightInd w:val="0"/>
+              <w:spacing w:before="0" w:line="240" w:lineRule="auto"/>
+              <w:ind w:right="297"/>
+              <w:rPr>
+                <w:rFonts w:cs="Arial"/>
+                <w:b/>
+                <w:color w:val="000000"/>
+                <w:sz w:val="28"/>
+                <w:szCs w:val="32"/>
+              </w:rPr>
+            </w:pPr>
+            <w:r>
+              <w:rPr>
+                <w:rFonts w:cs="Arial"/>
+                <w:b/>
+                <w:color w:val="000000"/>
+                <w:sz w:val="28"/>
+                <w:szCs w:val="32"/>
+              </w:rPr>
+              <w:t xml:space="preserve">Krama Vaakyam No. - </w:t>
+            </w:r>
+            <w:r>
+              <w:rPr>
+                <w:rFonts w:cs="Arial"/>
+                <w:b/>
+                <w:color w:val="000000"/>
+                <w:sz w:val="28"/>
+                <w:szCs w:val="32"/>
+              </w:rPr>
+              <w:t>18</w:t>
+            </w:r>
+          </w:p>
+          <w:p>
+            <w:pPr>
+              <w:widowControl w:val="0"/>
+              <w:tabs>
+                <w:tab w:val="left" w:pos="993"/>
+              </w:tabs>
+              <w:autoSpaceDE w:val="0"/>
+              <w:autoSpaceDN w:val="0"/>
+              <w:adjustRightInd w:val="0"/>
+              <w:spacing w:before="0" w:line="240" w:lineRule="auto"/>
+              <w:ind w:right="297"/>
+              <w:rPr>
+                <w:rFonts w:cs="Arial"/>
+                <w:b/>
+                <w:color w:val="000000"/>
+                <w:sz w:val="28"/>
+                <w:szCs w:val="32"/>
+              </w:rPr>
+            </w:pPr>
+            <w:r>
+              <w:rPr>
+                <w:rFonts w:cs="Arial"/>
+                <w:b/>
+                <w:color w:val="000000"/>
+                <w:sz w:val="28"/>
+                <w:szCs w:val="32"/>
+              </w:rPr>
+              <w:t>Panchaati No</w:t>
+            </w:r>
+            <w:r>
+              <w:rPr>
+                <w:rFonts w:cs="Arial"/>
+                <w:b/>
+                <w:color w:val="000000"/>
+                <w:szCs w:val="32"/>
+              </w:rPr>
+              <w:t>. -</w:t>
+            </w:r>
+            <w:r>
+              <w:rPr>
+                <w:rFonts w:cs="Arial"/>
+                <w:b/>
+                <w:color w:val="000000"/>
+                <w:sz w:val="28"/>
+                <w:szCs w:val="28"/>
+              </w:rPr>
+              <w:t xml:space="preserve"> 2</w:t>
+            </w:r>
+            <w:r>
+              <w:rPr>
+                <w:rFonts w:cs="Arial"/>
+                <w:b/>
+                <w:color w:val="000000"/>
+                <w:sz w:val="28"/>
+                <w:szCs w:val="28"/>
+              </w:rPr>
+              <w:t>9</w:t>
+            </w:r>
+          </w:p>
+        </w:tc>
+        <w:tc>
+          <w:tcPr>
+            <w:tcW w:w="5103" w:type="dxa"/>
+          </w:tcPr>
+          <w:p>
+            <w:pPr>
+              <w:widowControl w:val="0"/>
+              <w:autoSpaceDE w:val="0"/>
+              <w:autoSpaceDN w:val="0"/>
+              <w:adjustRightInd w:val="0"/>
+              <w:spacing w:before="0" w:line="240" w:lineRule="auto"/>
+              <w:rPr>
+                <w:rFonts w:ascii="Latha" w:hAnsi="Latha" w:cs="Latha"/>
+                <w:sz w:val="28"/>
+                <w:szCs w:val="28"/>
+                <w:cs/>
+                <w:lang w:bidi="ta-IN"/>
+              </w:rPr>
+            </w:pPr>
+            <w:r>
+              <w:rPr>
+                <w:rFonts w:ascii="Latha" w:hAnsi="Latha" w:cs="Latha"/>
+                <w:sz w:val="28"/>
+                <w:szCs w:val="28"/>
+                <w:cs/>
+                <w:lang w:bidi="ta-IN"/>
+              </w:rPr>
+              <w:t>ஜ</w:t>
+            </w:r>
+            <w:r>
+              <w:rPr>
+                <w:rFonts w:ascii="BRH Tamil Tab Extra" w:hAnsi="BRH Tamil Tab Extra" w:cs="Latha"/>
+                <w:b/>
+                <w:sz w:val="36"/>
+                <w:szCs w:val="28"/>
+                <w:lang w:bidi="ta-IN"/>
+              </w:rPr>
+              <w:t>…</w:t>
+            </w:r>
+            <w:r>
+              <w:rPr>
+                <w:rFonts w:ascii="Latha" w:hAnsi="Latha" w:cs="Latha"/>
+                <w:sz w:val="28"/>
+                <w:szCs w:val="28"/>
+                <w:cs/>
+                <w:lang w:bidi="ta-IN"/>
+              </w:rPr>
+              <w:t>ஜான</w:t>
+            </w:r>
+            <w:r>
+              <w:rPr>
+                <w:rFonts w:ascii="BRH Tamil Tab Extra" w:hAnsi="BRH Tamil Tab Extra" w:cs="Latha"/>
+                <w:b/>
+                <w:sz w:val="36"/>
+                <w:szCs w:val="28"/>
+                <w:lang w:bidi="ta-IN"/>
+              </w:rPr>
+              <w:t>…</w:t>
+            </w:r>
+            <w:r>
+              <w:rPr>
+                <w:rFonts w:ascii="Latha" w:hAnsi="Latha" w:cs="Latha"/>
+                <w:sz w:val="28"/>
+                <w:szCs w:val="28"/>
+                <w:lang w:bidi="ta-IN"/>
+              </w:rPr>
+              <w:t xml:space="preserve"> </w:t>
+            </w:r>
+            <w:r>
+              <w:rPr>
+                <w:rFonts w:ascii="Latha" w:hAnsi="Latha" w:cs="Latha"/>
+                <w:sz w:val="28"/>
+                <w:szCs w:val="28"/>
+                <w:cs/>
+                <w:lang w:bidi="ta-IN"/>
+              </w:rPr>
+              <w:t>கஸ்</w:t>
+            </w:r>
+            <w:r>
+              <w:rPr>
+                <w:rFonts w:ascii="Latha" w:hAnsi="Latha" w:cs="Latha"/>
+                <w:sz w:val="28"/>
+                <w:szCs w:val="28"/>
+                <w:highlight w:val="yellow"/>
+                <w:cs/>
+                <w:lang w:bidi="ta-IN"/>
+              </w:rPr>
+              <w:t>மே</w:t>
+            </w:r>
+            <w:r>
+              <w:rPr>
+                <w:rFonts w:ascii="BRH Tamil Tab Extra" w:hAnsi="BRH Tamil Tab Extra" w:cs="Latha"/>
+                <w:b/>
+                <w:sz w:val="36"/>
+                <w:szCs w:val="28"/>
+                <w:highlight w:val="yellow"/>
+                <w:lang w:bidi="ta-IN"/>
+              </w:rPr>
+              <w:t>‡</w:t>
+            </w:r>
+            <w:r>
+              <w:rPr>
+                <w:rFonts w:ascii="Latha" w:hAnsi="Latha" w:cs="Latha"/>
+                <w:szCs w:val="24"/>
+                <w:cs/>
+                <w:lang w:bidi="ta-IN"/>
+              </w:rPr>
+              <w:t xml:space="preserve"> </w:t>
+            </w:r>
+            <w:r>
+              <w:rPr>
+                <w:rFonts w:ascii="Latha" w:hAnsi="Latha" w:cs="Latha"/>
+                <w:sz w:val="28"/>
+                <w:szCs w:val="28"/>
+                <w:lang w:bidi="ta-IN"/>
+              </w:rPr>
+              <w:t xml:space="preserve"> | </w:t>
+            </w:r>
+            <w:r>
+              <w:rPr>
+                <w:rFonts w:ascii="Latha" w:hAnsi="Latha" w:cs="Latha"/>
+                <w:sz w:val="28"/>
+                <w:szCs w:val="28"/>
+                <w:lang w:bidi="ta-IN"/>
+              </w:rPr>
+              <w:br/>
+            </w:r>
+            <w:r>
+              <w:rPr>
+                <w:rFonts w:ascii="Latha" w:hAnsi="Latha" w:cs="Latha"/>
+                <w:sz w:val="28"/>
+                <w:szCs w:val="28"/>
+                <w:cs/>
+                <w:lang w:bidi="ta-IN"/>
+              </w:rPr>
+              <w:t>கஸ்மை</w:t>
+            </w:r>
+            <w:r>
+              <w:rPr>
+                <w:rFonts w:ascii="BRH Tamil Tab Extra" w:hAnsi="BRH Tamil Tab Extra" w:cs="Latha"/>
+                <w:b/>
+                <w:sz w:val="36"/>
+                <w:szCs w:val="28"/>
+                <w:lang w:bidi="ta-IN"/>
+              </w:rPr>
+              <w:t>†</w:t>
+            </w:r>
+            <w:r>
+              <w:rPr>
+                <w:rFonts w:ascii="Latha" w:hAnsi="Latha" w:cs="Latha"/>
+                <w:sz w:val="28"/>
+                <w:szCs w:val="28"/>
+                <w:lang w:bidi="ta-IN"/>
+              </w:rPr>
+              <w:t xml:space="preserve"> </w:t>
+            </w:r>
+            <w:r>
+              <w:rPr>
+                <w:rFonts w:ascii="Latha" w:hAnsi="Latha" w:cs="Latha"/>
+                <w:sz w:val="28"/>
+                <w:szCs w:val="28"/>
+                <w:cs/>
+                <w:lang w:bidi="ta-IN"/>
+              </w:rPr>
+              <w:t>தே</w:t>
+            </w:r>
+            <w:r>
+              <w:rPr>
+                <w:rFonts w:ascii="BRH Tamil Tab Extra" w:hAnsi="BRH Tamil Tab Extra" w:cs="Latha"/>
+                <w:b/>
+                <w:sz w:val="36"/>
+                <w:szCs w:val="28"/>
+                <w:lang w:bidi="ta-IN"/>
+              </w:rPr>
+              <w:t>…</w:t>
+            </w:r>
+            <w:r>
+              <w:rPr>
+                <w:rFonts w:ascii="Latha" w:hAnsi="Latha" w:cs="Latha"/>
+                <w:b/>
+                <w:bCs/>
+                <w:position w:val="-12"/>
+                <w:sz w:val="28"/>
+                <w:szCs w:val="28"/>
+                <w:cs/>
+                <w:lang w:bidi="ta-IN"/>
+              </w:rPr>
+              <w:t>3</w:t>
+            </w:r>
+            <w:r>
+              <w:rPr>
+                <w:rFonts w:ascii="Latha" w:hAnsi="Latha" w:cs="Latha"/>
+                <w:sz w:val="28"/>
+                <w:szCs w:val="28"/>
+                <w:cs/>
+                <w:lang w:bidi="ta-IN"/>
+              </w:rPr>
+              <w:t>வாய</w:t>
+            </w:r>
+            <w:r>
+              <w:rPr>
+                <w:rFonts w:ascii="BRH Tamil Tab Extra" w:hAnsi="BRH Tamil Tab Extra" w:cs="Latha"/>
+                <w:b/>
+                <w:sz w:val="36"/>
+                <w:szCs w:val="28"/>
+                <w:lang w:bidi="ta-IN"/>
+              </w:rPr>
+              <w:t>†</w:t>
+            </w:r>
+            <w:r>
+              <w:rPr>
+                <w:rFonts w:ascii="Latha" w:hAnsi="Latha" w:cs="Latha"/>
+                <w:sz w:val="28"/>
+                <w:szCs w:val="28"/>
+                <w:lang w:bidi="ta-IN"/>
+              </w:rPr>
+              <w:t xml:space="preserve"> |</w:t>
+            </w:r>
+          </w:p>
+        </w:tc>
+        <w:tc>
+          <w:tcPr>
+            <w:tcW w:w="5386" w:type="dxa"/>
+          </w:tcPr>
+          <w:p>
+            <w:pPr>
+              <w:widowControl w:val="0"/>
+              <w:autoSpaceDE w:val="0"/>
+              <w:autoSpaceDN w:val="0"/>
+              <w:adjustRightInd w:val="0"/>
+              <w:spacing w:before="0" w:line="240" w:lineRule="auto"/>
+              <w:rPr>
+                <w:rFonts w:ascii="Latha" w:hAnsi="Latha" w:cs="Latha"/>
+                <w:sz w:val="28"/>
+                <w:szCs w:val="28"/>
+                <w:cs/>
+                <w:lang w:bidi="ta-IN"/>
+              </w:rPr>
+            </w:pPr>
+            <w:r>
+              <w:rPr>
+                <w:rFonts w:ascii="Latha" w:hAnsi="Latha" w:cs="Latha"/>
+                <w:sz w:val="28"/>
+                <w:szCs w:val="28"/>
+                <w:cs/>
+                <w:lang w:bidi="ta-IN"/>
+              </w:rPr>
+              <w:t>ஜ</w:t>
+            </w:r>
+            <w:r>
+              <w:rPr>
+                <w:rFonts w:ascii="BRH Tamil Tab Extra" w:hAnsi="BRH Tamil Tab Extra" w:cs="Latha"/>
+                <w:b/>
+                <w:sz w:val="36"/>
+                <w:szCs w:val="28"/>
+                <w:lang w:bidi="ta-IN"/>
+              </w:rPr>
+              <w:t>…</w:t>
+            </w:r>
+            <w:r>
+              <w:rPr>
+                <w:rFonts w:ascii="Latha" w:hAnsi="Latha" w:cs="Latha"/>
+                <w:sz w:val="28"/>
+                <w:szCs w:val="28"/>
+                <w:cs/>
+                <w:lang w:bidi="ta-IN"/>
+              </w:rPr>
+              <w:t>ஜான</w:t>
+            </w:r>
+            <w:r>
+              <w:rPr>
+                <w:rFonts w:ascii="BRH Tamil Tab Extra" w:hAnsi="BRH Tamil Tab Extra" w:cs="Latha"/>
+                <w:b/>
+                <w:sz w:val="36"/>
+                <w:szCs w:val="28"/>
+                <w:lang w:bidi="ta-IN"/>
+              </w:rPr>
+              <w:t>…</w:t>
+            </w:r>
+            <w:r>
+              <w:rPr>
+                <w:rFonts w:ascii="Latha" w:hAnsi="Latha" w:cs="Latha"/>
+                <w:sz w:val="28"/>
+                <w:szCs w:val="28"/>
+                <w:lang w:bidi="ta-IN"/>
+              </w:rPr>
+              <w:t xml:space="preserve"> </w:t>
+            </w:r>
+            <w:r>
+              <w:rPr>
+                <w:rFonts w:ascii="Latha" w:hAnsi="Latha" w:cs="Latha"/>
+                <w:sz w:val="28"/>
+                <w:szCs w:val="28"/>
+                <w:cs/>
+                <w:lang w:bidi="ta-IN"/>
+              </w:rPr>
+              <w:t>கஸ்</w:t>
+            </w:r>
+            <w:r>
+              <w:rPr>
+                <w:rFonts w:ascii="Latha" w:hAnsi="Latha" w:cs="Latha"/>
+                <w:sz w:val="28"/>
+                <w:szCs w:val="28"/>
+                <w:highlight w:val="green"/>
+                <w:cs/>
+                <w:lang w:bidi="ta-IN"/>
+              </w:rPr>
+              <w:t>மை</w:t>
+            </w:r>
+            <w:r>
+              <w:rPr>
+                <w:rFonts w:ascii="BRH Tamil Tab Extra" w:hAnsi="BRH Tamil Tab Extra" w:cs="Latha"/>
+                <w:b/>
+                <w:bCs/>
+                <w:sz w:val="32"/>
+                <w:szCs w:val="32"/>
+                <w:lang w:bidi="ta-IN"/>
+              </w:rPr>
+              <w:t>‡</w:t>
+            </w:r>
+            <w:r>
+              <w:rPr>
+                <w:rFonts w:ascii="Latha" w:hAnsi="Latha" w:cs="Latha"/>
+                <w:sz w:val="28"/>
+                <w:szCs w:val="28"/>
+                <w:lang w:bidi="ta-IN"/>
+              </w:rPr>
+              <w:t xml:space="preserve"> | </w:t>
+            </w:r>
+            <w:r>
+              <w:rPr>
+                <w:rFonts w:ascii="Latha" w:hAnsi="Latha" w:cs="Latha"/>
+                <w:sz w:val="28"/>
+                <w:szCs w:val="28"/>
+                <w:lang w:bidi="ta-IN"/>
+              </w:rPr>
+              <w:br/>
+            </w:r>
+            <w:r>
+              <w:rPr>
+                <w:rFonts w:ascii="Latha" w:hAnsi="Latha" w:cs="Latha"/>
+                <w:sz w:val="28"/>
+                <w:szCs w:val="28"/>
+                <w:cs/>
+                <w:lang w:bidi="ta-IN"/>
+              </w:rPr>
+              <w:t>கஸ்மை</w:t>
+            </w:r>
+            <w:r>
+              <w:rPr>
+                <w:rFonts w:ascii="BRH Tamil Tab Extra" w:hAnsi="BRH Tamil Tab Extra" w:cs="Latha"/>
+                <w:b/>
+                <w:sz w:val="36"/>
+                <w:szCs w:val="28"/>
+                <w:lang w:bidi="ta-IN"/>
+              </w:rPr>
+              <w:t>†</w:t>
+            </w:r>
+            <w:r>
+              <w:rPr>
+                <w:rFonts w:ascii="Latha" w:hAnsi="Latha" w:cs="Latha"/>
+                <w:sz w:val="28"/>
+                <w:szCs w:val="28"/>
+                <w:lang w:bidi="ta-IN"/>
+              </w:rPr>
+              <w:t xml:space="preserve"> </w:t>
+            </w:r>
+            <w:r>
+              <w:rPr>
+                <w:rFonts w:ascii="Latha" w:hAnsi="Latha" w:cs="Latha"/>
+                <w:sz w:val="28"/>
+                <w:szCs w:val="28"/>
+                <w:cs/>
+                <w:lang w:bidi="ta-IN"/>
+              </w:rPr>
+              <w:t>தே</w:t>
+            </w:r>
+            <w:r>
+              <w:rPr>
+                <w:rFonts w:ascii="BRH Tamil Tab Extra" w:hAnsi="BRH Tamil Tab Extra" w:cs="Latha"/>
+                <w:b/>
+                <w:sz w:val="36"/>
+                <w:szCs w:val="28"/>
+                <w:lang w:bidi="ta-IN"/>
+              </w:rPr>
+              <w:t>…</w:t>
+            </w:r>
+            <w:r>
+              <w:rPr>
+                <w:rFonts w:ascii="Latha" w:hAnsi="Latha" w:cs="Latha"/>
+                <w:b/>
+                <w:bCs/>
+                <w:position w:val="-12"/>
+                <w:sz w:val="28"/>
+                <w:szCs w:val="28"/>
+                <w:cs/>
+                <w:lang w:bidi="ta-IN"/>
+              </w:rPr>
+              <w:t>3</w:t>
+            </w:r>
+            <w:r>
+              <w:rPr>
+                <w:rFonts w:ascii="Latha" w:hAnsi="Latha" w:cs="Latha"/>
+                <w:sz w:val="28"/>
+                <w:szCs w:val="28"/>
+                <w:cs/>
+                <w:lang w:bidi="ta-IN"/>
+              </w:rPr>
+              <w:t>வாய</w:t>
+            </w:r>
+            <w:r>
+              <w:rPr>
+                <w:rFonts w:ascii="BRH Tamil Tab Extra" w:hAnsi="BRH Tamil Tab Extra" w:cs="Latha"/>
+                <w:b/>
+                <w:sz w:val="36"/>
+                <w:szCs w:val="28"/>
+                <w:lang w:bidi="ta-IN"/>
+              </w:rPr>
+              <w:t>†</w:t>
+            </w:r>
+            <w:r>
+              <w:rPr>
+                <w:rFonts w:ascii="Latha" w:hAnsi="Latha" w:cs="Latha"/>
+                <w:sz w:val="28"/>
+                <w:szCs w:val="28"/>
+                <w:lang w:bidi="ta-IN"/>
+              </w:rPr>
+              <w:t xml:space="preserve"> |</w:t>
+            </w:r>
+          </w:p>
+        </w:tc>
+      </w:tr>
+      <w:tr>
+        <w:trPr>
+          <w:trHeight w:val="1104"/>
+        </w:trPr>
+        <w:tc>
+          <w:tcPr>
+            <w:tcW w:w="3974" w:type="dxa"/>
+          </w:tcPr>
+          <w:p>
+            <w:pPr>
+              <w:widowControl w:val="0"/>
+              <w:tabs>
+                <w:tab w:val="left" w:pos="993"/>
+              </w:tabs>
+              <w:autoSpaceDE w:val="0"/>
+              <w:autoSpaceDN w:val="0"/>
+              <w:adjustRightInd w:val="0"/>
+              <w:spacing w:before="0" w:line="240" w:lineRule="auto"/>
+              <w:ind w:right="297"/>
+              <w:rPr>
+                <w:rFonts w:cs="Arial"/>
+                <w:b/>
+                <w:color w:val="000000"/>
+                <w:sz w:val="28"/>
+                <w:szCs w:val="32"/>
+              </w:rPr>
+            </w:pPr>
+            <w:r>
+              <w:rPr>
+                <w:rFonts w:cs="Arial"/>
+                <w:b/>
+                <w:color w:val="000000"/>
+                <w:sz w:val="28"/>
+                <w:szCs w:val="32"/>
+              </w:rPr>
+              <w:t>T.S.</w:t>
+            </w:r>
+            <w:r>
+              <w:rPr>
+                <w:rFonts w:cs="Arial"/>
+                <w:b/>
+                <w:color w:val="000000"/>
+                <w:sz w:val="28"/>
+                <w:szCs w:val="32"/>
+              </w:rPr>
+              <w:t>4.2.</w:t>
+            </w:r>
+            <w:r>
+              <w:rPr>
+                <w:rFonts w:cs="Arial"/>
+                <w:b/>
+                <w:color w:val="000000"/>
+                <w:sz w:val="28"/>
+                <w:szCs w:val="32"/>
+              </w:rPr>
+              <w:t>8</w:t>
+            </w:r>
+            <w:r>
+              <w:rPr>
+                <w:rFonts w:cs="Arial"/>
+                <w:b/>
+                <w:color w:val="000000"/>
+                <w:sz w:val="28"/>
+                <w:szCs w:val="32"/>
+              </w:rPr>
+              <w:t>.</w:t>
+            </w:r>
+            <w:r>
+              <w:rPr>
+                <w:rFonts w:cs="Arial"/>
+                <w:b/>
+                <w:color w:val="000000"/>
+                <w:sz w:val="28"/>
+                <w:szCs w:val="32"/>
+              </w:rPr>
+              <w:t>2</w:t>
+            </w:r>
+            <w:r>
+              <w:rPr>
+                <w:rFonts w:cs="Arial"/>
+                <w:b/>
+                <w:color w:val="000000"/>
+                <w:sz w:val="28"/>
+                <w:szCs w:val="32"/>
+              </w:rPr>
+              <w:t xml:space="preserve"> </w:t>
+            </w:r>
+            <w:r>
+              <w:rPr>
+                <w:rFonts w:cs="Arial"/>
+                <w:b/>
+                <w:color w:val="000000"/>
+                <w:sz w:val="28"/>
+                <w:szCs w:val="32"/>
+              </w:rPr>
+              <w:t>– Kramam</w:t>
+            </w:r>
+          </w:p>
+          <w:p>
+            <w:pPr>
+              <w:widowControl w:val="0"/>
+              <w:tabs>
+                <w:tab w:val="left" w:pos="993"/>
+              </w:tabs>
+              <w:autoSpaceDE w:val="0"/>
+              <w:autoSpaceDN w:val="0"/>
+              <w:adjustRightInd w:val="0"/>
+              <w:spacing w:before="0" w:line="240" w:lineRule="auto"/>
+              <w:ind w:right="297"/>
+              <w:rPr>
+                <w:rFonts w:cs="Arial"/>
+                <w:b/>
+                <w:color w:val="000000"/>
+                <w:sz w:val="28"/>
+                <w:szCs w:val="32"/>
+              </w:rPr>
+            </w:pPr>
+            <w:r>
+              <w:rPr>
+                <w:rFonts w:cs="Arial"/>
+                <w:b/>
+                <w:color w:val="000000"/>
+                <w:sz w:val="28"/>
+                <w:szCs w:val="32"/>
+              </w:rPr>
+              <w:t xml:space="preserve">Krama Vaakyam No. - </w:t>
+            </w:r>
+            <w:r>
+              <w:rPr>
+                <w:rFonts w:cs="Arial"/>
+                <w:b/>
+                <w:color w:val="000000"/>
+                <w:sz w:val="28"/>
+                <w:szCs w:val="32"/>
+              </w:rPr>
+              <w:t>17</w:t>
+            </w:r>
+          </w:p>
+          <w:p>
+            <w:pPr>
+              <w:widowControl w:val="0"/>
+              <w:tabs>
+                <w:tab w:val="left" w:pos="993"/>
+              </w:tabs>
+              <w:autoSpaceDE w:val="0"/>
+              <w:autoSpaceDN w:val="0"/>
+              <w:adjustRightInd w:val="0"/>
+              <w:spacing w:before="0" w:line="240" w:lineRule="auto"/>
+              <w:ind w:right="297"/>
+              <w:rPr>
+                <w:rFonts w:cs="Arial"/>
+                <w:b/>
+                <w:color w:val="000000"/>
+                <w:sz w:val="28"/>
+                <w:szCs w:val="32"/>
+              </w:rPr>
+            </w:pPr>
+            <w:r>
+              <w:rPr>
+                <w:rFonts w:cs="Arial"/>
+                <w:b/>
+                <w:color w:val="000000"/>
+                <w:sz w:val="28"/>
+                <w:szCs w:val="32"/>
+              </w:rPr>
+              <w:t>Panchaati No</w:t>
+            </w:r>
+            <w:r>
+              <w:rPr>
+                <w:rFonts w:cs="Arial"/>
+                <w:b/>
+                <w:color w:val="000000"/>
+                <w:szCs w:val="32"/>
+              </w:rPr>
+              <w:t>. -</w:t>
+            </w:r>
+            <w:r>
+              <w:rPr>
+                <w:rFonts w:cs="Arial"/>
+                <w:b/>
+                <w:color w:val="000000"/>
+                <w:sz w:val="28"/>
+                <w:szCs w:val="28"/>
+              </w:rPr>
+              <w:t xml:space="preserve"> </w:t>
+            </w:r>
+            <w:r>
+              <w:rPr>
+                <w:rFonts w:cs="Arial"/>
+                <w:b/>
+                <w:color w:val="000000"/>
+                <w:sz w:val="28"/>
+                <w:szCs w:val="28"/>
+              </w:rPr>
+              <w:t>34</w:t>
+            </w:r>
+          </w:p>
+        </w:tc>
+        <w:tc>
+          <w:tcPr>
+            <w:tcW w:w="5103" w:type="dxa"/>
+          </w:tcPr>
+          <w:p>
+            <w:pPr>
+              <w:widowControl w:val="0"/>
+              <w:autoSpaceDE w:val="0"/>
+              <w:autoSpaceDN w:val="0"/>
+              <w:adjustRightInd w:val="0"/>
+              <w:spacing w:before="0" w:line="240" w:lineRule="auto"/>
+              <w:rPr>
+                <w:rFonts w:ascii="Latha" w:hAnsi="Latha" w:cs="Latha"/>
+                <w:sz w:val="28"/>
+                <w:szCs w:val="28"/>
+                <w:lang w:bidi="ta-IN"/>
+              </w:rPr>
+            </w:pPr>
+            <w:r>
+              <w:rPr>
+                <w:rFonts w:ascii="Latha" w:hAnsi="Latha" w:cs="Latha"/>
+                <w:sz w:val="28"/>
+                <w:szCs w:val="28"/>
+                <w:cs/>
+                <w:lang w:bidi="ta-IN"/>
+              </w:rPr>
+              <w:t>வே</w:t>
+            </w:r>
+            <w:r>
+              <w:rPr>
+                <w:rFonts w:ascii="BRH Tamil Tab Extra" w:hAnsi="BRH Tamil Tab Extra" w:cs="Latha"/>
+                <w:b/>
+                <w:sz w:val="36"/>
+                <w:szCs w:val="28"/>
+                <w:lang w:bidi="ta-IN"/>
+              </w:rPr>
+              <w:t>…</w:t>
+            </w:r>
+            <w:r>
+              <w:rPr>
+                <w:rFonts w:ascii="Latha" w:hAnsi="Latha" w:cs="Latha"/>
+                <w:sz w:val="28"/>
+                <w:szCs w:val="28"/>
+                <w:cs/>
+                <w:lang w:bidi="ta-IN"/>
+              </w:rPr>
+              <w:t>ன</w:t>
+            </w:r>
+            <w:r>
+              <w:rPr>
+                <w:rFonts w:ascii="Latha" w:hAnsi="Latha" w:cs="Latha"/>
+                <w:sz w:val="28"/>
+                <w:szCs w:val="28"/>
+                <w:lang w:bidi="ta-IN"/>
+              </w:rPr>
+              <w:t xml:space="preserve"> </w:t>
+            </w:r>
+            <w:r>
+              <w:rPr>
+                <w:rFonts w:ascii="Latha" w:hAnsi="Latha" w:cs="Latha"/>
+                <w:sz w:val="28"/>
+                <w:szCs w:val="28"/>
+                <w:cs/>
+                <w:lang w:bidi="ta-IN"/>
+              </w:rPr>
+              <w:t>ஆ</w:t>
+            </w:r>
+            <w:r>
+              <w:rPr>
+                <w:rFonts w:ascii="BRH Tamil Tab Extra" w:hAnsi="BRH Tamil Tab Extra" w:cs="Latha"/>
+                <w:b/>
+                <w:sz w:val="36"/>
+                <w:szCs w:val="28"/>
+                <w:lang w:bidi="ta-IN"/>
+              </w:rPr>
+              <w:t>†</w:t>
+            </w:r>
+            <w:r>
+              <w:rPr>
+                <w:rFonts w:ascii="Latha" w:hAnsi="Latha" w:cs="Latha"/>
+                <w:sz w:val="28"/>
+                <w:szCs w:val="28"/>
+                <w:cs/>
+                <w:lang w:bidi="ta-IN"/>
+              </w:rPr>
+              <w:t>வ</w:t>
+            </w:r>
+            <w:r>
+              <w:rPr>
+                <w:rFonts w:ascii="Latha" w:hAnsi="Latha" w:cs="Latha"/>
+                <w:b/>
+                <w:bCs/>
+                <w:sz w:val="32"/>
+                <w:szCs w:val="32"/>
+                <w:cs/>
+                <w:lang w:bidi="ta-IN"/>
+              </w:rPr>
+              <w:t>:</w:t>
+            </w:r>
+            <w:r>
+              <w:rPr>
+                <w:rFonts w:ascii="Latha" w:hAnsi="Latha" w:cs="Latha"/>
+                <w:sz w:val="28"/>
+                <w:szCs w:val="28"/>
+                <w:lang w:bidi="ta-IN"/>
+              </w:rPr>
+              <w:t xml:space="preserve"> |</w:t>
+            </w:r>
+            <w:r>
+              <w:rPr>
+                <w:rFonts w:ascii="Latha" w:hAnsi="Latha" w:cs="Latha"/>
+                <w:sz w:val="28"/>
+                <w:szCs w:val="28"/>
+                <w:lang w:bidi="ta-IN"/>
+              </w:rPr>
+              <w:t xml:space="preserve"> </w:t>
+            </w:r>
+            <w:r>
+              <w:rPr>
+                <w:rFonts w:ascii="Latha" w:hAnsi="Latha" w:cs="Latha"/>
+                <w:sz w:val="28"/>
+                <w:szCs w:val="28"/>
+                <w:lang w:bidi="ta-IN"/>
+              </w:rPr>
+              <w:br/>
+            </w:r>
+            <w:r>
+              <w:rPr>
+                <w:rFonts w:ascii="Latha" w:hAnsi="Latha" w:cs="Latha"/>
+                <w:sz w:val="28"/>
+                <w:szCs w:val="28"/>
+                <w:highlight w:val="yellow"/>
+                <w:cs/>
+                <w:lang w:bidi="ta-IN"/>
+              </w:rPr>
+              <w:t>ஆ</w:t>
+            </w:r>
+            <w:r>
+              <w:rPr>
+                <w:rFonts w:ascii="BRH Tamil Tab Extra" w:hAnsi="BRH Tamil Tab Extra" w:cs="Latha"/>
+                <w:b/>
+                <w:sz w:val="36"/>
+                <w:szCs w:val="28"/>
+                <w:highlight w:val="yellow"/>
+                <w:lang w:bidi="ta-IN"/>
+              </w:rPr>
+              <w:t>…</w:t>
+            </w:r>
+            <w:r>
+              <w:rPr>
+                <w:rFonts w:ascii="Latha" w:hAnsi="Latha" w:cs="Latha"/>
+                <w:sz w:val="28"/>
+                <w:szCs w:val="28"/>
+                <w:highlight w:val="yellow"/>
+                <w:cs/>
+                <w:lang w:bidi="ta-IN"/>
+              </w:rPr>
+              <w:t>வ</w:t>
+            </w:r>
+            <w:r>
+              <w:rPr>
+                <w:rFonts w:ascii="BRH Tamil Tab Extra" w:hAnsi="BRH Tamil Tab Extra" w:cs="Latha"/>
+                <w:b/>
+                <w:sz w:val="36"/>
+                <w:szCs w:val="28"/>
+                <w:highlight w:val="yellow"/>
+                <w:lang w:bidi="ta-IN"/>
+              </w:rPr>
+              <w:t>…</w:t>
+            </w:r>
+            <w:r>
+              <w:rPr>
+                <w:rFonts w:ascii="Latha" w:hAnsi="Latha" w:cs="Latha"/>
+                <w:sz w:val="28"/>
+                <w:szCs w:val="28"/>
+                <w:highlight w:val="yellow"/>
+                <w:lang w:bidi="ta-IN"/>
+              </w:rPr>
+              <w:t xml:space="preserve"> </w:t>
+            </w:r>
+            <w:r>
+              <w:rPr>
+                <w:rFonts w:ascii="Latha" w:hAnsi="Latha" w:cs="Latha"/>
+                <w:sz w:val="28"/>
+                <w:szCs w:val="28"/>
+                <w:highlight w:val="yellow"/>
+                <w:cs/>
+                <w:lang w:bidi="ta-IN"/>
+              </w:rPr>
+              <w:t>இத்யா</w:t>
+            </w:r>
+            <w:r>
+              <w:rPr>
+                <w:rFonts w:ascii="BRH Tamil Tab Extra" w:hAnsi="BRH Tamil Tab Extra" w:cs="Latha"/>
+                <w:b/>
+                <w:sz w:val="36"/>
+                <w:szCs w:val="28"/>
+                <w:highlight w:val="yellow"/>
+                <w:lang w:bidi="ta-IN"/>
+              </w:rPr>
+              <w:t>†</w:t>
+            </w:r>
+            <w:r>
+              <w:rPr>
+                <w:rFonts w:ascii="Latha" w:hAnsi="Latha" w:cs="Latha"/>
+                <w:sz w:val="28"/>
+                <w:szCs w:val="28"/>
+                <w:highlight w:val="yellow"/>
+                <w:cs/>
+                <w:lang w:bidi="ta-IN"/>
+              </w:rPr>
+              <w:t>வ</w:t>
+            </w:r>
+            <w:r>
+              <w:rPr>
+                <w:rFonts w:ascii="Latha" w:hAnsi="Latha" w:cs="Latha"/>
+                <w:b/>
+                <w:bCs/>
+                <w:sz w:val="32"/>
+                <w:szCs w:val="32"/>
+                <w:highlight w:val="yellow"/>
+                <w:cs/>
+                <w:lang w:bidi="ta-IN"/>
+              </w:rPr>
+              <w:t>:</w:t>
+            </w:r>
+            <w:r>
+              <w:rPr>
+                <w:rFonts w:ascii="Latha" w:hAnsi="Latha" w:cs="Latha"/>
+                <w:sz w:val="28"/>
+                <w:szCs w:val="28"/>
+                <w:lang w:bidi="ta-IN"/>
+              </w:rPr>
+              <w:t xml:space="preserve"> </w:t>
+            </w:r>
+            <w:r>
+              <w:rPr>
+                <w:rFonts w:ascii="Latha" w:hAnsi="Latha" w:cs="Latha"/>
+                <w:sz w:val="28"/>
+                <w:szCs w:val="28"/>
+                <w:lang w:bidi="ta-IN"/>
+              </w:rPr>
+              <w:t>|</w:t>
+            </w:r>
+          </w:p>
+          <w:p>
+            <w:pPr>
+              <w:pStyle w:val="NoSpacing"/>
+              <w:rPr>
+                <w:cs/>
+                <w:lang w:bidi="ta-IN"/>
+              </w:rPr>
+            </w:pPr>
+          </w:p>
+        </w:tc>
+        <w:tc>
+          <w:tcPr>
+            <w:tcW w:w="5386" w:type="dxa"/>
+          </w:tcPr>
+          <w:p>
+            <w:pPr>
+              <w:widowControl w:val="0"/>
+              <w:autoSpaceDE w:val="0"/>
+              <w:autoSpaceDN w:val="0"/>
+              <w:adjustRightInd w:val="0"/>
+              <w:spacing w:before="0" w:line="240" w:lineRule="auto"/>
+              <w:rPr>
+                <w:rFonts w:ascii="Latha" w:hAnsi="Latha" w:cs="Latha"/>
+                <w:sz w:val="28"/>
+                <w:szCs w:val="28"/>
+                <w:highlight w:val="green"/>
+                <w:lang w:bidi="ta-IN"/>
+              </w:rPr>
+            </w:pPr>
+            <w:r>
+              <w:rPr>
+                <w:rFonts w:ascii="Latha" w:hAnsi="Latha" w:cs="Latha"/>
+                <w:sz w:val="28"/>
+                <w:szCs w:val="28"/>
+                <w:cs/>
+                <w:lang w:bidi="ta-IN"/>
+              </w:rPr>
+              <w:t>வே</w:t>
+            </w:r>
+            <w:r>
+              <w:rPr>
+                <w:rFonts w:ascii="BRH Tamil Tab Extra" w:hAnsi="BRH Tamil Tab Extra" w:cs="Latha"/>
+                <w:b/>
+                <w:sz w:val="36"/>
+                <w:szCs w:val="28"/>
+                <w:lang w:bidi="ta-IN"/>
+              </w:rPr>
+              <w:t>…</w:t>
+            </w:r>
+            <w:r>
+              <w:rPr>
+                <w:rFonts w:ascii="Latha" w:hAnsi="Latha" w:cs="Latha"/>
+                <w:sz w:val="28"/>
+                <w:szCs w:val="28"/>
+                <w:cs/>
+                <w:lang w:bidi="ta-IN"/>
+              </w:rPr>
+              <w:t>ன</w:t>
+            </w:r>
+            <w:r>
+              <w:rPr>
+                <w:rFonts w:ascii="Latha" w:hAnsi="Latha" w:cs="Latha"/>
+                <w:sz w:val="28"/>
+                <w:szCs w:val="28"/>
+                <w:lang w:bidi="ta-IN"/>
+              </w:rPr>
+              <w:t xml:space="preserve"> </w:t>
+            </w:r>
+            <w:r>
+              <w:rPr>
+                <w:rFonts w:ascii="Latha" w:hAnsi="Latha" w:cs="Latha"/>
+                <w:sz w:val="28"/>
+                <w:szCs w:val="28"/>
+                <w:cs/>
+                <w:lang w:bidi="ta-IN"/>
+              </w:rPr>
+              <w:t>ஆ</w:t>
+            </w:r>
+            <w:r>
+              <w:rPr>
+                <w:rFonts w:ascii="BRH Tamil Tab Extra" w:hAnsi="BRH Tamil Tab Extra" w:cs="Latha"/>
+                <w:b/>
+                <w:sz w:val="36"/>
+                <w:szCs w:val="28"/>
+                <w:lang w:bidi="ta-IN"/>
+              </w:rPr>
+              <w:t>†</w:t>
+            </w:r>
+            <w:r>
+              <w:rPr>
+                <w:rFonts w:ascii="Latha" w:hAnsi="Latha" w:cs="Latha"/>
+                <w:sz w:val="28"/>
+                <w:szCs w:val="28"/>
+                <w:cs/>
+                <w:lang w:bidi="ta-IN"/>
+              </w:rPr>
+              <w:t>வ</w:t>
+            </w:r>
+            <w:r>
+              <w:rPr>
+                <w:rFonts w:ascii="Latha" w:hAnsi="Latha" w:cs="Latha"/>
+                <w:b/>
+                <w:bCs/>
+                <w:sz w:val="32"/>
+                <w:szCs w:val="32"/>
+                <w:cs/>
+                <w:lang w:bidi="ta-IN"/>
+              </w:rPr>
+              <w:t>:</w:t>
+            </w:r>
+            <w:r>
+              <w:rPr>
+                <w:rFonts w:ascii="Latha" w:hAnsi="Latha" w:cs="Latha"/>
+                <w:sz w:val="28"/>
+                <w:szCs w:val="28"/>
+                <w:lang w:bidi="ta-IN"/>
+              </w:rPr>
+              <w:t xml:space="preserve"> |</w:t>
+            </w:r>
+          </w:p>
+          <w:p>
+            <w:pPr>
+              <w:widowControl w:val="0"/>
+              <w:autoSpaceDE w:val="0"/>
+              <w:autoSpaceDN w:val="0"/>
+              <w:adjustRightInd w:val="0"/>
+              <w:spacing w:before="0" w:line="240" w:lineRule="auto"/>
+              <w:rPr>
+                <w:rFonts w:ascii="Latha" w:hAnsi="Latha" w:cs="Latha"/>
+                <w:sz w:val="28"/>
+                <w:szCs w:val="28"/>
+                <w:cs/>
+                <w:lang w:bidi="ta-IN"/>
+              </w:rPr>
+            </w:pPr>
+            <w:r>
+              <w:rPr>
+                <w:rFonts w:ascii="Latha" w:hAnsi="Latha" w:cs="Latha"/>
+                <w:sz w:val="28"/>
+                <w:szCs w:val="28"/>
+                <w:highlight w:val="green"/>
+                <w:cs/>
+                <w:lang w:bidi="ta-IN"/>
+              </w:rPr>
+              <w:t>ஆ</w:t>
+            </w:r>
+            <w:r>
+              <w:rPr>
+                <w:rFonts w:ascii="BRH Tamil Tab Extra" w:hAnsi="BRH Tamil Tab Extra" w:cs="Latha"/>
+                <w:b/>
+                <w:bCs/>
+                <w:sz w:val="28"/>
+                <w:szCs w:val="28"/>
+                <w:highlight w:val="green"/>
+                <w:lang w:bidi="ta-IN"/>
+              </w:rPr>
+              <w:t>…</w:t>
+            </w:r>
+            <w:r>
+              <w:rPr>
+                <w:rFonts w:ascii="Latha" w:hAnsi="Latha" w:cs="Latha"/>
+                <w:sz w:val="28"/>
+                <w:szCs w:val="28"/>
+                <w:highlight w:val="green"/>
+                <w:cs/>
+                <w:lang w:bidi="ta-IN"/>
+              </w:rPr>
+              <w:t>வ</w:t>
+            </w:r>
+            <w:r>
+              <w:rPr>
+                <w:rFonts w:ascii="BRH Tamil Tab Extra" w:hAnsi="BRH Tamil Tab Extra" w:cs="Latha"/>
+                <w:b/>
+                <w:bCs/>
+                <w:sz w:val="28"/>
+                <w:szCs w:val="28"/>
+                <w:highlight w:val="green"/>
+                <w:lang w:bidi="ta-IN"/>
+              </w:rPr>
+              <w:t>…</w:t>
+            </w:r>
+            <w:r>
+              <w:rPr>
+                <w:rFonts w:ascii="Latha" w:hAnsi="Latha" w:cs="Latha"/>
+                <w:sz w:val="28"/>
+                <w:szCs w:val="28"/>
+                <w:highlight w:val="green"/>
+                <w:cs/>
+                <w:lang w:bidi="ta-IN"/>
+              </w:rPr>
+              <w:t>ரித்யா</w:t>
+            </w:r>
+            <w:r>
+              <w:rPr>
+                <w:rFonts w:ascii="BRH Tamil Tab Extra" w:hAnsi="BRH Tamil Tab Extra" w:cs="Latha"/>
+                <w:b/>
+                <w:bCs/>
+                <w:sz w:val="28"/>
+                <w:szCs w:val="28"/>
+                <w:highlight w:val="green"/>
+                <w:lang w:bidi="ta-IN"/>
+              </w:rPr>
+              <w:t>†</w:t>
+            </w:r>
+            <w:r>
+              <w:rPr>
+                <w:rFonts w:ascii="Latha" w:hAnsi="Latha" w:cs="Latha"/>
+                <w:sz w:val="28"/>
+                <w:szCs w:val="28"/>
+                <w:highlight w:val="green"/>
+                <w:cs/>
+                <w:lang w:bidi="ta-IN"/>
+              </w:rPr>
+              <w:t>வ</w:t>
+            </w:r>
+            <w:r>
+              <w:rPr>
+                <w:rFonts w:ascii="Latha" w:hAnsi="Latha" w:cs="Latha"/>
+                <w:b/>
+                <w:bCs/>
+                <w:sz w:val="28"/>
+                <w:szCs w:val="28"/>
+                <w:highlight w:val="green"/>
+                <w:cs/>
+                <w:lang w:bidi="ta-IN"/>
+              </w:rPr>
+              <w:t>:</w:t>
+            </w:r>
+            <w:r>
+              <w:rPr>
+                <w:rFonts w:ascii="Latha" w:hAnsi="Latha" w:cs="Latha"/>
+                <w:b/>
+                <w:bCs/>
+                <w:sz w:val="28"/>
+                <w:szCs w:val="28"/>
+                <w:lang w:bidi="ta-IN"/>
+              </w:rPr>
+              <w:t xml:space="preserve"> </w:t>
+            </w:r>
+            <w:r>
+              <w:rPr>
+                <w:rFonts w:ascii="Latha" w:hAnsi="Latha" w:cs="Latha"/>
+                <w:sz w:val="28"/>
+                <w:szCs w:val="28"/>
+                <w:lang w:bidi="ta-IN"/>
+              </w:rPr>
+              <w:t>||</w:t>
+            </w:r>
+          </w:p>
+        </w:tc>
+      </w:tr>
+      <w:tr>
+        <w:trPr>
+          <w:trHeight w:val="1104"/>
+        </w:trPr>
+        <w:tc>
+          <w:tcPr>
+            <w:tcW w:w="3974" w:type="dxa"/>
+          </w:tcPr>
+          <w:p>
+            <w:pPr>
+              <w:widowControl w:val="0"/>
+              <w:tabs>
+                <w:tab w:val="left" w:pos="993"/>
+              </w:tabs>
+              <w:autoSpaceDE w:val="0"/>
+              <w:autoSpaceDN w:val="0"/>
+              <w:adjustRightInd w:val="0"/>
+              <w:spacing w:before="0" w:line="240" w:lineRule="auto"/>
+              <w:ind w:right="297"/>
+              <w:rPr>
+                <w:rFonts w:cs="Arial"/>
+                <w:b/>
+                <w:color w:val="000000"/>
+                <w:sz w:val="28"/>
+                <w:szCs w:val="32"/>
+              </w:rPr>
+            </w:pPr>
+            <w:r>
+              <w:rPr>
+                <w:rFonts w:cs="Arial"/>
+                <w:b/>
+                <w:color w:val="000000"/>
+                <w:sz w:val="28"/>
+                <w:szCs w:val="32"/>
+              </w:rPr>
+              <w:t>T.S.</w:t>
+            </w:r>
+            <w:r>
+              <w:rPr>
+                <w:rFonts w:cs="Arial"/>
+                <w:b/>
+                <w:color w:val="000000"/>
+                <w:sz w:val="28"/>
+                <w:szCs w:val="32"/>
+              </w:rPr>
+              <w:t xml:space="preserve">4.2.8.2 </w:t>
+            </w:r>
+            <w:r>
+              <w:rPr>
+                <w:rFonts w:cs="Arial"/>
+                <w:b/>
+                <w:color w:val="000000"/>
+                <w:sz w:val="28"/>
+                <w:szCs w:val="32"/>
+              </w:rPr>
+              <w:t>– Kramam</w:t>
+            </w:r>
+          </w:p>
+          <w:p>
+            <w:pPr>
+              <w:widowControl w:val="0"/>
+              <w:tabs>
+                <w:tab w:val="left" w:pos="993"/>
+              </w:tabs>
+              <w:autoSpaceDE w:val="0"/>
+              <w:autoSpaceDN w:val="0"/>
+              <w:adjustRightInd w:val="0"/>
+              <w:spacing w:before="0" w:line="240" w:lineRule="auto"/>
+              <w:ind w:right="297"/>
+              <w:rPr>
+                <w:rFonts w:cs="Arial"/>
+                <w:b/>
+                <w:color w:val="000000"/>
+                <w:sz w:val="28"/>
+                <w:szCs w:val="32"/>
+              </w:rPr>
+            </w:pPr>
+            <w:r>
+              <w:rPr>
+                <w:rFonts w:cs="Arial"/>
+                <w:b/>
+                <w:color w:val="000000"/>
+                <w:sz w:val="28"/>
+                <w:szCs w:val="32"/>
+              </w:rPr>
+              <w:t xml:space="preserve">Krama Vaakyam No. - </w:t>
+            </w:r>
+            <w:r>
+              <w:rPr>
+                <w:rFonts w:cs="Arial"/>
+                <w:b/>
+                <w:color w:val="000000"/>
+                <w:sz w:val="28"/>
+                <w:szCs w:val="32"/>
+              </w:rPr>
+              <w:t>30</w:t>
+            </w:r>
+          </w:p>
+          <w:p>
+            <w:pPr>
+              <w:widowControl w:val="0"/>
+              <w:tabs>
+                <w:tab w:val="left" w:pos="993"/>
+              </w:tabs>
+              <w:autoSpaceDE w:val="0"/>
+              <w:autoSpaceDN w:val="0"/>
+              <w:adjustRightInd w:val="0"/>
+              <w:spacing w:before="0" w:line="240" w:lineRule="auto"/>
+              <w:ind w:right="297"/>
+              <w:rPr>
+                <w:rFonts w:cs="Arial"/>
+                <w:b/>
+                <w:color w:val="000000"/>
+                <w:sz w:val="28"/>
+                <w:szCs w:val="32"/>
+              </w:rPr>
+            </w:pPr>
+            <w:r>
+              <w:rPr>
+                <w:rFonts w:cs="Arial"/>
+                <w:b/>
+                <w:color w:val="000000"/>
+                <w:sz w:val="28"/>
+                <w:szCs w:val="32"/>
+              </w:rPr>
+              <w:t>Panchaati No</w:t>
+            </w:r>
+            <w:r>
+              <w:rPr>
+                <w:rFonts w:cs="Arial"/>
+                <w:b/>
+                <w:color w:val="000000"/>
+                <w:szCs w:val="32"/>
+              </w:rPr>
+              <w:t>. -</w:t>
+            </w:r>
+            <w:r>
+              <w:rPr>
+                <w:rFonts w:cs="Arial"/>
+                <w:b/>
+                <w:color w:val="000000"/>
+                <w:sz w:val="28"/>
+                <w:szCs w:val="28"/>
+              </w:rPr>
+              <w:t xml:space="preserve"> </w:t>
+            </w:r>
+            <w:r>
+              <w:rPr>
+                <w:rFonts w:cs="Arial"/>
+                <w:b/>
+                <w:color w:val="000000"/>
+                <w:sz w:val="28"/>
+                <w:szCs w:val="28"/>
+              </w:rPr>
+              <w:t>34</w:t>
+            </w:r>
+          </w:p>
+        </w:tc>
+        <w:tc>
+          <w:tcPr>
+            <w:tcW w:w="5103" w:type="dxa"/>
+          </w:tcPr>
+          <w:p>
+            <w:pPr>
+              <w:widowControl w:val="0"/>
+              <w:autoSpaceDE w:val="0"/>
+              <w:autoSpaceDN w:val="0"/>
+              <w:adjustRightInd w:val="0"/>
+              <w:spacing w:before="0" w:line="240" w:lineRule="auto"/>
+              <w:rPr>
+                <w:rFonts w:ascii="Latha" w:hAnsi="Latha" w:cs="Latha"/>
+                <w:sz w:val="28"/>
+                <w:szCs w:val="28"/>
+                <w:cs/>
+                <w:lang w:bidi="ta-IN"/>
+              </w:rPr>
+            </w:pPr>
+            <w:r>
+              <w:rPr>
+                <w:rFonts w:ascii="Latha" w:hAnsi="Latha" w:cs="Latha"/>
+                <w:sz w:val="28"/>
+                <w:szCs w:val="28"/>
+                <w:cs/>
+                <w:lang w:bidi="ta-IN"/>
+              </w:rPr>
+              <w:t>ச</w:t>
+            </w:r>
+            <w:r>
+              <w:rPr>
+                <w:rFonts w:ascii="BRH Tamil Tab Extra" w:hAnsi="BRH Tamil Tab Extra" w:cs="Latha"/>
+                <w:b/>
+                <w:sz w:val="36"/>
+                <w:szCs w:val="28"/>
+                <w:lang w:bidi="ta-IN"/>
+              </w:rPr>
+              <w:t>…</w:t>
+            </w:r>
+            <w:r>
+              <w:rPr>
+                <w:rFonts w:ascii="Latha" w:hAnsi="Latha" w:cs="Latha"/>
+                <w:sz w:val="28"/>
+                <w:szCs w:val="28"/>
+                <w:lang w:bidi="ta-IN"/>
+              </w:rPr>
+              <w:t xml:space="preserve"> </w:t>
+            </w:r>
+            <w:r>
+              <w:rPr>
+                <w:rFonts w:ascii="Latha" w:hAnsi="Latha" w:cs="Latha"/>
+                <w:sz w:val="28"/>
+                <w:szCs w:val="28"/>
+                <w:cs/>
+                <w:lang w:bidi="ta-IN"/>
+              </w:rPr>
+              <w:t>விவ</w:t>
+            </w:r>
+            <w:r>
+              <w:rPr>
+                <w:rFonts w:ascii="BRH Tamil Tab Extra" w:hAnsi="BRH Tamil Tab Extra" w:cs="Latha"/>
+                <w:b/>
+                <w:sz w:val="36"/>
+                <w:szCs w:val="28"/>
+                <w:lang w:bidi="ta-IN"/>
+              </w:rPr>
+              <w:t>†</w:t>
+            </w:r>
+            <w:r>
+              <w:rPr>
+                <w:rFonts w:ascii="Latha" w:hAnsi="Latha" w:cs="Latha"/>
+                <w:b/>
+                <w:bCs/>
+                <w:sz w:val="32"/>
+                <w:szCs w:val="32"/>
+                <w:cs/>
+                <w:lang w:bidi="ta-IN"/>
+              </w:rPr>
+              <w:t>:</w:t>
+            </w:r>
+            <w:r>
+              <w:rPr>
+                <w:rFonts w:ascii="Latha" w:hAnsi="Latha" w:cs="Latha"/>
+                <w:sz w:val="28"/>
+                <w:szCs w:val="28"/>
+                <w:lang w:bidi="ta-IN"/>
+              </w:rPr>
+              <w:t xml:space="preserve"> | </w:t>
+            </w:r>
+            <w:r>
+              <w:rPr>
+                <w:rFonts w:ascii="Latha" w:hAnsi="Latha" w:cs="Latha"/>
+                <w:sz w:val="28"/>
+                <w:szCs w:val="28"/>
+                <w:cs/>
+                <w:lang w:bidi="ta-IN"/>
+              </w:rPr>
+              <w:t>வி</w:t>
+            </w:r>
+            <w:r>
+              <w:rPr>
+                <w:rFonts w:ascii="Latha" w:hAnsi="Latha" w:cs="Latha"/>
+                <w:sz w:val="28"/>
+                <w:szCs w:val="28"/>
+                <w:highlight w:val="yellow"/>
+                <w:cs/>
+                <w:lang w:bidi="ta-IN"/>
+              </w:rPr>
+              <w:t>வ</w:t>
+            </w:r>
+            <w:r>
+              <w:rPr>
+                <w:rFonts w:ascii="BRH Tamil Tab Extra" w:hAnsi="BRH Tamil Tab Extra" w:cs="Latha"/>
+                <w:b/>
+                <w:sz w:val="36"/>
+                <w:szCs w:val="28"/>
+                <w:highlight w:val="yellow"/>
+                <w:lang w:bidi="ta-IN"/>
+              </w:rPr>
+              <w:t>…</w:t>
+            </w:r>
+            <w:r>
+              <w:rPr>
+                <w:rFonts w:ascii="Latha" w:hAnsi="Latha" w:cs="Latha"/>
+                <w:sz w:val="28"/>
+                <w:szCs w:val="28"/>
+                <w:highlight w:val="yellow"/>
+                <w:lang w:bidi="ta-IN"/>
+              </w:rPr>
+              <w:t xml:space="preserve"> </w:t>
+            </w:r>
+            <w:r>
+              <w:rPr>
+                <w:rFonts w:ascii="Latha" w:hAnsi="Latha" w:cs="Latha"/>
+                <w:sz w:val="28"/>
+                <w:szCs w:val="28"/>
+                <w:highlight w:val="yellow"/>
+                <w:cs/>
+                <w:lang w:bidi="ta-IN"/>
+              </w:rPr>
+              <w:t>இ</w:t>
+            </w:r>
+            <w:r>
+              <w:rPr>
+                <w:rFonts w:ascii="Latha" w:hAnsi="Latha" w:cs="Latha"/>
+                <w:sz w:val="28"/>
+                <w:szCs w:val="28"/>
+                <w:cs/>
+                <w:lang w:bidi="ta-IN"/>
+              </w:rPr>
+              <w:t>தி</w:t>
+            </w:r>
+            <w:r>
+              <w:rPr>
+                <w:rFonts w:ascii="BRH Tamil Tab Extra" w:hAnsi="BRH Tamil Tab Extra" w:cs="Latha"/>
+                <w:b/>
+                <w:sz w:val="36"/>
+                <w:szCs w:val="28"/>
+                <w:lang w:bidi="ta-IN"/>
+              </w:rPr>
+              <w:t>…</w:t>
+            </w:r>
+            <w:r>
+              <w:rPr>
+                <w:rFonts w:ascii="Latha" w:hAnsi="Latha" w:cs="Latha"/>
+                <w:sz w:val="28"/>
+                <w:szCs w:val="28"/>
+                <w:lang w:bidi="ta-IN"/>
+              </w:rPr>
+              <w:t xml:space="preserve"> </w:t>
+            </w:r>
+            <w:r>
+              <w:rPr>
+                <w:rFonts w:ascii="Latha" w:hAnsi="Latha" w:cs="Latha"/>
+                <w:sz w:val="28"/>
+                <w:szCs w:val="28"/>
+                <w:cs/>
+                <w:lang w:bidi="ta-IN"/>
+              </w:rPr>
+              <w:t>விவ</w:t>
+            </w:r>
+            <w:r>
+              <w:rPr>
+                <w:rFonts w:ascii="BRH Tamil Tab Extra" w:hAnsi="BRH Tamil Tab Extra" w:cs="Latha"/>
+                <w:b/>
+                <w:sz w:val="36"/>
+                <w:szCs w:val="28"/>
+                <w:lang w:bidi="ta-IN"/>
+              </w:rPr>
+              <w:t>†</w:t>
+            </w:r>
+            <w:r>
+              <w:rPr>
+                <w:rFonts w:ascii="Latha" w:hAnsi="Latha" w:cs="Latha"/>
+                <w:b/>
+                <w:bCs/>
+                <w:sz w:val="32"/>
+                <w:szCs w:val="32"/>
+                <w:cs/>
+                <w:lang w:bidi="ta-IN"/>
+              </w:rPr>
+              <w:t>:</w:t>
+            </w:r>
+            <w:r>
+              <w:rPr>
+                <w:rFonts w:ascii="Latha" w:hAnsi="Latha" w:cs="Latha"/>
+                <w:sz w:val="28"/>
+                <w:szCs w:val="28"/>
+                <w:lang w:bidi="ta-IN"/>
+              </w:rPr>
+              <w:t xml:space="preserve"> ||</w:t>
+            </w:r>
+          </w:p>
+        </w:tc>
+        <w:tc>
+          <w:tcPr>
+            <w:tcW w:w="5386" w:type="dxa"/>
+          </w:tcPr>
+          <w:p>
+            <w:pPr>
+              <w:widowControl w:val="0"/>
+              <w:autoSpaceDE w:val="0"/>
+              <w:autoSpaceDN w:val="0"/>
+              <w:adjustRightInd w:val="0"/>
+              <w:spacing w:before="0" w:line="240" w:lineRule="auto"/>
+              <w:rPr>
+                <w:rFonts w:ascii="Latha" w:hAnsi="Latha" w:cs="Latha"/>
+                <w:sz w:val="28"/>
+                <w:szCs w:val="28"/>
+                <w:cs/>
+                <w:lang w:bidi="ta-IN"/>
+              </w:rPr>
+            </w:pPr>
+            <w:r>
+              <w:rPr>
+                <w:rFonts w:ascii="Latha" w:hAnsi="Latha" w:cs="Latha"/>
+                <w:sz w:val="28"/>
+                <w:szCs w:val="28"/>
+                <w:cs/>
+                <w:lang w:bidi="ta-IN"/>
+              </w:rPr>
+              <w:t>ச</w:t>
+            </w:r>
+            <w:r>
+              <w:rPr>
+                <w:rFonts w:ascii="BRH Tamil Tab Extra" w:hAnsi="BRH Tamil Tab Extra" w:cs="Latha"/>
+                <w:b/>
+                <w:sz w:val="36"/>
+                <w:szCs w:val="28"/>
+                <w:lang w:bidi="ta-IN"/>
+              </w:rPr>
+              <w:t>…</w:t>
+            </w:r>
+            <w:r>
+              <w:rPr>
+                <w:rFonts w:ascii="Latha" w:hAnsi="Latha" w:cs="Latha"/>
+                <w:sz w:val="28"/>
+                <w:szCs w:val="28"/>
+                <w:lang w:bidi="ta-IN"/>
+              </w:rPr>
+              <w:t xml:space="preserve"> </w:t>
+            </w:r>
+            <w:r>
+              <w:rPr>
+                <w:rFonts w:ascii="Latha" w:hAnsi="Latha" w:cs="Latha"/>
+                <w:sz w:val="28"/>
+                <w:szCs w:val="28"/>
+                <w:cs/>
+                <w:lang w:bidi="ta-IN"/>
+              </w:rPr>
+              <w:t>விவ</w:t>
+            </w:r>
+            <w:r>
+              <w:rPr>
+                <w:rFonts w:ascii="BRH Tamil Tab Extra" w:hAnsi="BRH Tamil Tab Extra" w:cs="Latha"/>
+                <w:b/>
+                <w:sz w:val="36"/>
+                <w:szCs w:val="28"/>
+                <w:lang w:bidi="ta-IN"/>
+              </w:rPr>
+              <w:t>†</w:t>
+            </w:r>
+            <w:r>
+              <w:rPr>
+                <w:rFonts w:ascii="Latha" w:hAnsi="Latha" w:cs="Latha"/>
+                <w:b/>
+                <w:bCs/>
+                <w:sz w:val="32"/>
+                <w:szCs w:val="32"/>
+                <w:cs/>
+                <w:lang w:bidi="ta-IN"/>
+              </w:rPr>
+              <w:t>:</w:t>
+            </w:r>
+            <w:r>
+              <w:rPr>
+                <w:rFonts w:ascii="Latha" w:hAnsi="Latha" w:cs="Latha"/>
+                <w:sz w:val="28"/>
+                <w:szCs w:val="28"/>
+                <w:lang w:bidi="ta-IN"/>
+              </w:rPr>
+              <w:t xml:space="preserve"> | </w:t>
+            </w:r>
+            <w:r>
+              <w:rPr>
+                <w:rFonts w:ascii="Latha" w:hAnsi="Latha" w:cs="Latha"/>
+                <w:sz w:val="28"/>
+                <w:szCs w:val="28"/>
+                <w:cs/>
+                <w:lang w:bidi="ta-IN"/>
+              </w:rPr>
+              <w:t>விவ</w:t>
+            </w:r>
+            <w:r>
+              <w:rPr>
+                <w:rFonts w:ascii="BRH Tamil Tab Extra" w:hAnsi="BRH Tamil Tab Extra" w:cs="Latha"/>
+                <w:b/>
+                <w:sz w:val="36"/>
+                <w:szCs w:val="28"/>
+                <w:lang w:bidi="ta-IN"/>
+              </w:rPr>
+              <w:t>…</w:t>
+            </w:r>
+            <w:r>
+              <w:rPr>
+                <w:rFonts w:ascii="Latha" w:hAnsi="Latha" w:cs="Latha"/>
+                <w:sz w:val="28"/>
+                <w:szCs w:val="28"/>
+                <w:highlight w:val="green"/>
+                <w:cs/>
+                <w:lang w:bidi="ta-IN"/>
+              </w:rPr>
+              <w:t>ரி</w:t>
+            </w:r>
+            <w:r>
+              <w:rPr>
+                <w:rFonts w:ascii="Latha" w:hAnsi="Latha" w:cs="Latha"/>
+                <w:sz w:val="28"/>
+                <w:szCs w:val="28"/>
+                <w:cs/>
+                <w:lang w:bidi="ta-IN"/>
+              </w:rPr>
+              <w:t>தி</w:t>
+            </w:r>
+            <w:r>
+              <w:rPr>
+                <w:rFonts w:ascii="BRH Tamil Tab Extra" w:hAnsi="BRH Tamil Tab Extra" w:cs="Latha"/>
+                <w:b/>
+                <w:sz w:val="36"/>
+                <w:szCs w:val="28"/>
+                <w:lang w:bidi="ta-IN"/>
+              </w:rPr>
+              <w:t>…</w:t>
+            </w:r>
+            <w:r>
+              <w:rPr>
+                <w:rFonts w:ascii="Latha" w:hAnsi="Latha" w:cs="Latha"/>
+                <w:sz w:val="28"/>
+                <w:szCs w:val="28"/>
+                <w:lang w:bidi="ta-IN"/>
+              </w:rPr>
+              <w:t xml:space="preserve"> </w:t>
+            </w:r>
+            <w:r>
+              <w:rPr>
+                <w:rFonts w:ascii="Latha" w:hAnsi="Latha" w:cs="Latha"/>
+                <w:sz w:val="28"/>
+                <w:szCs w:val="28"/>
+                <w:cs/>
+                <w:lang w:bidi="ta-IN"/>
+              </w:rPr>
+              <w:t>விவ</w:t>
+            </w:r>
+            <w:r>
+              <w:rPr>
+                <w:rFonts w:ascii="BRH Tamil Tab Extra" w:hAnsi="BRH Tamil Tab Extra" w:cs="Latha"/>
+                <w:b/>
+                <w:sz w:val="36"/>
+                <w:szCs w:val="28"/>
+                <w:lang w:bidi="ta-IN"/>
+              </w:rPr>
+              <w:t>†</w:t>
+            </w:r>
+            <w:r>
+              <w:rPr>
+                <w:rFonts w:ascii="Latha" w:hAnsi="Latha" w:cs="Latha"/>
+                <w:b/>
+                <w:bCs/>
+                <w:sz w:val="32"/>
+                <w:szCs w:val="32"/>
+                <w:cs/>
+                <w:lang w:bidi="ta-IN"/>
+              </w:rPr>
+              <w:t>:</w:t>
+            </w:r>
+            <w:r>
+              <w:rPr>
+                <w:rFonts w:ascii="Latha" w:hAnsi="Latha" w:cs="Latha"/>
+                <w:sz w:val="28"/>
+                <w:szCs w:val="28"/>
+                <w:lang w:bidi="ta-IN"/>
+              </w:rPr>
+              <w:t xml:space="preserve"> ||</w:t>
+            </w:r>
+          </w:p>
+        </w:tc>
+      </w:tr>
+      <w:tr>
+        <w:trPr>
+          <w:trHeight w:val="1104"/>
+        </w:trPr>
+        <w:tc>
+          <w:tcPr>
+            <w:tcW w:w="3974" w:type="dxa"/>
+          </w:tcPr>
+          <w:p>
+            <w:pPr>
+              <w:widowControl w:val="0"/>
+              <w:tabs>
+                <w:tab w:val="left" w:pos="993"/>
+              </w:tabs>
+              <w:autoSpaceDE w:val="0"/>
+              <w:autoSpaceDN w:val="0"/>
+              <w:adjustRightInd w:val="0"/>
+              <w:spacing w:before="0" w:line="240" w:lineRule="auto"/>
+              <w:ind w:right="297"/>
+              <w:rPr>
+                <w:rFonts w:cs="Arial"/>
+                <w:b/>
+                <w:color w:val="000000"/>
+                <w:sz w:val="28"/>
+                <w:szCs w:val="32"/>
+              </w:rPr>
+            </w:pPr>
+            <w:r>
+              <w:rPr>
+                <w:rFonts w:cs="Arial"/>
+                <w:b/>
+                <w:color w:val="000000"/>
+                <w:sz w:val="28"/>
+                <w:szCs w:val="32"/>
+              </w:rPr>
+              <w:t>T.S.</w:t>
+            </w:r>
+            <w:r>
+              <w:rPr>
+                <w:rFonts w:cs="Arial"/>
+                <w:b/>
+                <w:color w:val="000000"/>
+                <w:sz w:val="28"/>
+                <w:szCs w:val="32"/>
+              </w:rPr>
+              <w:t>4.2.11.</w:t>
+            </w:r>
+            <w:r>
+              <w:rPr>
+                <w:rFonts w:cs="Arial"/>
+                <w:b/>
+                <w:color w:val="000000"/>
+                <w:sz w:val="28"/>
+                <w:szCs w:val="32"/>
+              </w:rPr>
+              <w:t>1</w:t>
+            </w:r>
+            <w:r>
+              <w:rPr>
+                <w:rFonts w:cs="Arial"/>
+                <w:b/>
+                <w:color w:val="000000"/>
+                <w:sz w:val="28"/>
+                <w:szCs w:val="32"/>
+              </w:rPr>
+              <w:t xml:space="preserve"> </w:t>
+            </w:r>
+            <w:r>
+              <w:rPr>
+                <w:rFonts w:cs="Arial"/>
+                <w:b/>
+                <w:color w:val="000000"/>
+                <w:sz w:val="28"/>
+                <w:szCs w:val="32"/>
+              </w:rPr>
+              <w:t>– Kramam</w:t>
+            </w:r>
+          </w:p>
+          <w:p>
+            <w:pPr>
+              <w:widowControl w:val="0"/>
+              <w:tabs>
+                <w:tab w:val="left" w:pos="993"/>
+              </w:tabs>
+              <w:autoSpaceDE w:val="0"/>
+              <w:autoSpaceDN w:val="0"/>
+              <w:adjustRightInd w:val="0"/>
+              <w:spacing w:before="0" w:line="240" w:lineRule="auto"/>
+              <w:ind w:right="297"/>
+              <w:rPr>
+                <w:rFonts w:cs="Arial"/>
+                <w:b/>
+                <w:color w:val="000000"/>
+                <w:sz w:val="28"/>
+                <w:szCs w:val="32"/>
+              </w:rPr>
+            </w:pPr>
+            <w:r>
+              <w:rPr>
+                <w:rFonts w:cs="Arial"/>
+                <w:b/>
+                <w:color w:val="000000"/>
+                <w:sz w:val="28"/>
+                <w:szCs w:val="32"/>
+              </w:rPr>
+              <w:t xml:space="preserve">Krama Vaakyam No. - </w:t>
+            </w:r>
+            <w:r>
+              <w:rPr>
+                <w:rFonts w:cs="Arial"/>
+                <w:b/>
+                <w:color w:val="000000"/>
+                <w:sz w:val="28"/>
+                <w:szCs w:val="32"/>
+              </w:rPr>
+              <w:t>4</w:t>
+            </w:r>
+          </w:p>
+          <w:p>
+            <w:pPr>
+              <w:widowControl w:val="0"/>
+              <w:tabs>
+                <w:tab w:val="left" w:pos="993"/>
+              </w:tabs>
+              <w:autoSpaceDE w:val="0"/>
+              <w:autoSpaceDN w:val="0"/>
+              <w:adjustRightInd w:val="0"/>
+              <w:spacing w:before="0" w:line="240" w:lineRule="auto"/>
+              <w:ind w:right="297"/>
+              <w:rPr>
+                <w:rFonts w:cs="Arial"/>
+                <w:b/>
+                <w:color w:val="000000"/>
+                <w:sz w:val="28"/>
+                <w:szCs w:val="32"/>
+              </w:rPr>
+            </w:pPr>
+            <w:r>
+              <w:rPr>
+                <w:rFonts w:cs="Arial"/>
+                <w:b/>
+                <w:color w:val="000000"/>
+                <w:sz w:val="28"/>
+                <w:szCs w:val="32"/>
+              </w:rPr>
+              <w:t>Panchaati No</w:t>
+            </w:r>
+            <w:r>
+              <w:rPr>
+                <w:rFonts w:cs="Arial"/>
+                <w:b/>
+                <w:color w:val="000000"/>
+                <w:szCs w:val="32"/>
+              </w:rPr>
+              <w:t>. -</w:t>
+            </w:r>
+            <w:r>
+              <w:rPr>
+                <w:rFonts w:cs="Arial"/>
+                <w:b/>
+                <w:color w:val="000000"/>
+                <w:szCs w:val="32"/>
+              </w:rPr>
+              <w:t xml:space="preserve"> </w:t>
+            </w:r>
+            <w:r>
+              <w:rPr>
+                <w:rFonts w:cs="Arial"/>
+                <w:b/>
+                <w:color w:val="000000"/>
+                <w:sz w:val="28"/>
+                <w:szCs w:val="32"/>
+              </w:rPr>
+              <w:t>4</w:t>
+            </w:r>
+            <w:r>
+              <w:rPr>
+                <w:rFonts w:cs="Arial"/>
+                <w:b/>
+                <w:color w:val="000000"/>
+                <w:sz w:val="28"/>
+                <w:szCs w:val="32"/>
+              </w:rPr>
+              <w:t>6</w:t>
+            </w:r>
+          </w:p>
+        </w:tc>
+        <w:tc>
+          <w:tcPr>
+            <w:tcW w:w="5103" w:type="dxa"/>
+          </w:tcPr>
+          <w:p>
+            <w:pPr>
+              <w:widowControl w:val="0"/>
+              <w:autoSpaceDE w:val="0"/>
+              <w:autoSpaceDN w:val="0"/>
+              <w:adjustRightInd w:val="0"/>
+              <w:spacing w:before="0" w:line="240" w:lineRule="auto"/>
+              <w:rPr>
+                <w:rFonts w:ascii="Latha" w:hAnsi="Latha" w:cs="Latha"/>
+                <w:sz w:val="28"/>
+                <w:szCs w:val="28"/>
+                <w:cs/>
+                <w:lang w:bidi="ta-IN"/>
+              </w:rPr>
+            </w:pPr>
+            <w:r>
+              <w:rPr>
+                <w:rFonts w:ascii="Latha" w:hAnsi="Latha" w:cs="Latha"/>
+                <w:sz w:val="28"/>
+                <w:szCs w:val="28"/>
+                <w:cs/>
+                <w:lang w:bidi="ta-IN"/>
+              </w:rPr>
+              <w:t>ரோ</w:t>
+            </w:r>
+            <w:r>
+              <w:rPr>
+                <w:rFonts w:ascii="BRH Tamil Tab Extra" w:hAnsi="BRH Tamil Tab Extra" w:cs="Latha"/>
+                <w:b/>
+                <w:sz w:val="36"/>
+                <w:szCs w:val="28"/>
+                <w:lang w:bidi="ta-IN"/>
+              </w:rPr>
+              <w:t>…</w:t>
+            </w:r>
+            <w:r>
+              <w:rPr>
+                <w:rFonts w:ascii="Latha" w:hAnsi="Latha" w:cs="Latha"/>
+                <w:sz w:val="28"/>
+                <w:szCs w:val="28"/>
+                <w:cs/>
+                <w:lang w:bidi="ta-IN"/>
+              </w:rPr>
+              <w:t>ச</w:t>
+            </w:r>
+            <w:r>
+              <w:rPr>
+                <w:rFonts w:ascii="BRH Tamil Tab Extra" w:hAnsi="BRH Tamil Tab Extra" w:cs="Latha"/>
+                <w:b/>
+                <w:sz w:val="36"/>
+                <w:szCs w:val="28"/>
+                <w:lang w:bidi="ta-IN"/>
+              </w:rPr>
+              <w:t>…</w:t>
+            </w:r>
+            <w:r>
+              <w:rPr>
+                <w:rFonts w:ascii="Latha" w:hAnsi="Latha" w:cs="Latha"/>
+                <w:sz w:val="28"/>
+                <w:szCs w:val="28"/>
+                <w:cs/>
+                <w:lang w:bidi="ta-IN"/>
+              </w:rPr>
+              <w:t>னா</w:t>
+            </w:r>
+            <w:r>
+              <w:rPr>
+                <w:rFonts w:ascii="Latha" w:hAnsi="Latha" w:cs="Latha"/>
+                <w:sz w:val="28"/>
+                <w:szCs w:val="28"/>
+                <w:lang w:bidi="ta-IN"/>
+              </w:rPr>
+              <w:t xml:space="preserve"> </w:t>
+            </w:r>
+            <w:r>
+              <w:rPr>
+                <w:rFonts w:ascii="Latha" w:hAnsi="Latha" w:cs="Latha"/>
+                <w:sz w:val="28"/>
+                <w:szCs w:val="28"/>
+                <w:cs/>
+                <w:lang w:bidi="ta-IN"/>
+              </w:rPr>
+              <w:t>தி</w:t>
+            </w:r>
+            <w:r>
+              <w:rPr>
+                <w:rFonts w:ascii="BRH Tamil Tab Extra" w:hAnsi="BRH Tamil Tab Extra" w:cs="Latha"/>
+                <w:b/>
+                <w:sz w:val="36"/>
+                <w:szCs w:val="28"/>
+                <w:lang w:bidi="ta-IN"/>
+              </w:rPr>
+              <w:t>…</w:t>
+            </w:r>
+            <w:r>
+              <w:rPr>
+                <w:rFonts w:ascii="Latha" w:hAnsi="Latha" w:cs="Latha"/>
+                <w:b/>
+                <w:bCs/>
+                <w:position w:val="-12"/>
+                <w:sz w:val="28"/>
+                <w:szCs w:val="28"/>
+                <w:cs/>
+                <w:lang w:bidi="ta-IN"/>
+              </w:rPr>
+              <w:t>3</w:t>
+            </w:r>
+            <w:r>
+              <w:rPr>
+                <w:rFonts w:ascii="Latha" w:hAnsi="Latha" w:cs="Latha"/>
+                <w:sz w:val="28"/>
+                <w:szCs w:val="28"/>
+                <w:cs/>
+                <w:lang w:bidi="ta-IN"/>
+              </w:rPr>
+              <w:t>வ</w:t>
+            </w:r>
+            <w:r>
+              <w:rPr>
+                <w:rFonts w:ascii="Latha" w:hAnsi="Latha" w:cs="Latha"/>
+                <w:b/>
+                <w:bCs/>
+                <w:sz w:val="32"/>
+                <w:szCs w:val="32"/>
+                <w:cs/>
+                <w:lang w:bidi="ta-IN"/>
+              </w:rPr>
+              <w:t>:</w:t>
+            </w:r>
+            <w:r>
+              <w:rPr>
+                <w:rFonts w:ascii="Latha" w:hAnsi="Latha" w:cs="Latha"/>
+                <w:sz w:val="28"/>
+                <w:szCs w:val="28"/>
+                <w:lang w:bidi="ta-IN"/>
+              </w:rPr>
+              <w:t xml:space="preserve"> | </w:t>
+            </w:r>
+            <w:r>
+              <w:rPr>
+                <w:rFonts w:ascii="Latha" w:hAnsi="Latha" w:cs="Latha"/>
+                <w:sz w:val="28"/>
+                <w:szCs w:val="28"/>
+                <w:highlight w:val="yellow"/>
+                <w:cs/>
+                <w:lang w:bidi="ta-IN"/>
+              </w:rPr>
+              <w:t>தி</w:t>
+            </w:r>
+            <w:r>
+              <w:rPr>
+                <w:rFonts w:ascii="BRH Tamil Tab Extra" w:hAnsi="BRH Tamil Tab Extra" w:cs="Latha"/>
+                <w:b/>
+                <w:sz w:val="36"/>
+                <w:szCs w:val="28"/>
+                <w:highlight w:val="yellow"/>
+                <w:lang w:bidi="ta-IN"/>
+              </w:rPr>
+              <w:t>…</w:t>
+            </w:r>
+            <w:r>
+              <w:rPr>
+                <w:rFonts w:ascii="Latha" w:hAnsi="Latha" w:cs="Latha"/>
+                <w:b/>
+                <w:bCs/>
+                <w:position w:val="-12"/>
+                <w:sz w:val="28"/>
+                <w:szCs w:val="28"/>
+                <w:highlight w:val="yellow"/>
+                <w:cs/>
+                <w:lang w:bidi="ta-IN"/>
+              </w:rPr>
+              <w:t>3</w:t>
+            </w:r>
+            <w:r>
+              <w:rPr>
+                <w:rFonts w:ascii="Latha" w:hAnsi="Latha" w:cs="Latha"/>
+                <w:sz w:val="28"/>
+                <w:szCs w:val="28"/>
+                <w:highlight w:val="yellow"/>
+                <w:cs/>
+                <w:lang w:bidi="ta-IN"/>
+              </w:rPr>
+              <w:t>வ</w:t>
+            </w:r>
+            <w:r>
+              <w:rPr>
+                <w:rFonts w:ascii="Latha" w:hAnsi="Latha" w:cs="Latha"/>
+                <w:b/>
+                <w:bCs/>
+                <w:sz w:val="32"/>
+                <w:szCs w:val="32"/>
+                <w:highlight w:val="yellow"/>
+                <w:cs/>
+                <w:lang w:bidi="ta-IN"/>
+              </w:rPr>
+              <w:t>:</w:t>
+            </w:r>
+            <w:r>
+              <w:rPr>
+                <w:rFonts w:ascii="Latha" w:hAnsi="Latha" w:cs="Latha"/>
+                <w:sz w:val="28"/>
+                <w:szCs w:val="28"/>
+                <w:highlight w:val="yellow"/>
+                <w:lang w:bidi="ta-IN"/>
+              </w:rPr>
+              <w:t xml:space="preserve"> </w:t>
+            </w:r>
+            <w:r>
+              <w:rPr>
+                <w:rFonts w:ascii="Latha" w:hAnsi="Latha" w:cs="Latha"/>
+                <w:sz w:val="28"/>
+                <w:szCs w:val="28"/>
+                <w:highlight w:val="yellow"/>
+                <w:cs/>
+                <w:lang w:bidi="ta-IN"/>
+              </w:rPr>
+              <w:t>பரி</w:t>
+            </w:r>
+            <w:r>
+              <w:rPr>
+                <w:rFonts w:ascii="BRH Tamil Tab Extra" w:hAnsi="BRH Tamil Tab Extra" w:cs="Latha"/>
+                <w:b/>
+                <w:sz w:val="36"/>
+                <w:szCs w:val="28"/>
+                <w:lang w:bidi="ta-IN"/>
+              </w:rPr>
+              <w:t>†</w:t>
+            </w:r>
+            <w:r>
+              <w:rPr>
+                <w:rFonts w:ascii="Latha" w:hAnsi="Latha" w:cs="Latha"/>
+                <w:sz w:val="28"/>
+                <w:szCs w:val="28"/>
+                <w:lang w:bidi="ta-IN"/>
+              </w:rPr>
+              <w:t xml:space="preserve"> </w:t>
+            </w:r>
+            <w:r>
+              <w:rPr>
+                <w:rFonts w:ascii="Latha" w:hAnsi="Latha" w:cs="Latha"/>
+                <w:sz w:val="28"/>
+                <w:szCs w:val="28"/>
+                <w:lang w:bidi="ta-IN"/>
+              </w:rPr>
+              <w:t>|</w:t>
+            </w:r>
+          </w:p>
+        </w:tc>
+        <w:tc>
+          <w:tcPr>
+            <w:tcW w:w="5386" w:type="dxa"/>
+          </w:tcPr>
+          <w:p>
+            <w:pPr>
+              <w:widowControl w:val="0"/>
+              <w:autoSpaceDE w:val="0"/>
+              <w:autoSpaceDN w:val="0"/>
+              <w:adjustRightInd w:val="0"/>
+              <w:spacing w:before="0" w:line="240" w:lineRule="auto"/>
+              <w:rPr>
+                <w:rFonts w:ascii="Latha" w:hAnsi="Latha" w:cs="Latha"/>
+                <w:sz w:val="28"/>
+                <w:szCs w:val="28"/>
+                <w:lang w:bidi="ta-IN"/>
+              </w:rPr>
+            </w:pPr>
+            <w:r>
+              <w:rPr>
+                <w:rFonts w:ascii="Latha" w:hAnsi="Latha" w:cs="Latha"/>
+                <w:sz w:val="28"/>
+                <w:szCs w:val="28"/>
+                <w:cs/>
+                <w:lang w:bidi="ta-IN"/>
+              </w:rPr>
+              <w:t>ரோ</w:t>
+            </w:r>
+            <w:r>
+              <w:rPr>
+                <w:rFonts w:ascii="BRH Tamil Tab Extra" w:hAnsi="BRH Tamil Tab Extra" w:cs="Latha"/>
+                <w:b/>
+                <w:sz w:val="36"/>
+                <w:szCs w:val="28"/>
+                <w:lang w:bidi="ta-IN"/>
+              </w:rPr>
+              <w:t>…</w:t>
+            </w:r>
+            <w:r>
+              <w:rPr>
+                <w:rFonts w:ascii="Latha" w:hAnsi="Latha" w:cs="Latha"/>
+                <w:sz w:val="28"/>
+                <w:szCs w:val="28"/>
+                <w:cs/>
+                <w:lang w:bidi="ta-IN"/>
+              </w:rPr>
+              <w:t>ச</w:t>
+            </w:r>
+            <w:r>
+              <w:rPr>
+                <w:rFonts w:ascii="BRH Tamil Tab Extra" w:hAnsi="BRH Tamil Tab Extra" w:cs="Latha"/>
+                <w:b/>
+                <w:sz w:val="36"/>
+                <w:szCs w:val="28"/>
+                <w:lang w:bidi="ta-IN"/>
+              </w:rPr>
+              <w:t>…</w:t>
+            </w:r>
+            <w:r>
+              <w:rPr>
+                <w:rFonts w:ascii="Latha" w:hAnsi="Latha" w:cs="Latha"/>
+                <w:sz w:val="28"/>
+                <w:szCs w:val="28"/>
+                <w:cs/>
+                <w:lang w:bidi="ta-IN"/>
+              </w:rPr>
+              <w:t>னா</w:t>
+            </w:r>
+            <w:r>
+              <w:rPr>
+                <w:rFonts w:ascii="Latha" w:hAnsi="Latha" w:cs="Latha"/>
+                <w:sz w:val="28"/>
+                <w:szCs w:val="28"/>
+                <w:lang w:bidi="ta-IN"/>
+              </w:rPr>
+              <w:t xml:space="preserve"> </w:t>
+            </w:r>
+            <w:r>
+              <w:rPr>
+                <w:rFonts w:ascii="Latha" w:hAnsi="Latha" w:cs="Latha"/>
+                <w:sz w:val="28"/>
+                <w:szCs w:val="28"/>
+                <w:cs/>
+                <w:lang w:bidi="ta-IN"/>
+              </w:rPr>
+              <w:t>தி</w:t>
+            </w:r>
+            <w:r>
+              <w:rPr>
+                <w:rFonts w:ascii="BRH Tamil Tab Extra" w:hAnsi="BRH Tamil Tab Extra" w:cs="Latha"/>
+                <w:b/>
+                <w:sz w:val="36"/>
+                <w:szCs w:val="28"/>
+                <w:lang w:bidi="ta-IN"/>
+              </w:rPr>
+              <w:t>…</w:t>
+            </w:r>
+            <w:r>
+              <w:rPr>
+                <w:rFonts w:ascii="Latha" w:hAnsi="Latha" w:cs="Latha"/>
+                <w:b/>
+                <w:bCs/>
+                <w:position w:val="-12"/>
+                <w:sz w:val="28"/>
+                <w:szCs w:val="28"/>
+                <w:cs/>
+                <w:lang w:bidi="ta-IN"/>
+              </w:rPr>
+              <w:t>3</w:t>
+            </w:r>
+            <w:r>
+              <w:rPr>
+                <w:rFonts w:ascii="Latha" w:hAnsi="Latha" w:cs="Latha"/>
+                <w:sz w:val="28"/>
+                <w:szCs w:val="28"/>
+                <w:cs/>
+                <w:lang w:bidi="ta-IN"/>
+              </w:rPr>
+              <w:t>வ</w:t>
+            </w:r>
+            <w:r>
+              <w:rPr>
+                <w:rFonts w:ascii="Latha" w:hAnsi="Latha" w:cs="Latha"/>
+                <w:b/>
+                <w:bCs/>
+                <w:sz w:val="32"/>
+                <w:szCs w:val="32"/>
+                <w:cs/>
+                <w:lang w:bidi="ta-IN"/>
+              </w:rPr>
+              <w:t>:</w:t>
+            </w:r>
+            <w:r>
+              <w:rPr>
+                <w:rFonts w:ascii="Latha" w:hAnsi="Latha" w:cs="Latha"/>
+                <w:sz w:val="28"/>
+                <w:szCs w:val="28"/>
+                <w:lang w:bidi="ta-IN"/>
+              </w:rPr>
+              <w:t xml:space="preserve"> | </w:t>
+            </w:r>
+            <w:r>
+              <w:rPr>
+                <w:rFonts w:ascii="Latha" w:hAnsi="Latha" w:cs="Latha"/>
+                <w:sz w:val="28"/>
+                <w:szCs w:val="28"/>
+                <w:cs/>
+                <w:lang w:bidi="ta-IN"/>
+              </w:rPr>
+              <w:t>தி</w:t>
+            </w:r>
+            <w:r>
+              <w:rPr>
+                <w:rFonts w:ascii="BRH Tamil Tab Extra" w:hAnsi="BRH Tamil Tab Extra" w:cs="Latha"/>
+                <w:b/>
+                <w:sz w:val="36"/>
+                <w:szCs w:val="28"/>
+                <w:lang w:bidi="ta-IN"/>
+              </w:rPr>
+              <w:t>…</w:t>
+            </w:r>
+            <w:r>
+              <w:rPr>
+                <w:rFonts w:ascii="Latha" w:hAnsi="Latha" w:cs="Latha"/>
+                <w:b/>
+                <w:bCs/>
+                <w:position w:val="-12"/>
+                <w:sz w:val="28"/>
+                <w:szCs w:val="28"/>
+                <w:cs/>
+                <w:lang w:bidi="ta-IN"/>
+              </w:rPr>
+              <w:t>3</w:t>
+            </w:r>
+            <w:r>
+              <w:rPr>
+                <w:rFonts w:ascii="Latha" w:hAnsi="Latha" w:cs="Latha"/>
+                <w:sz w:val="28"/>
+                <w:szCs w:val="28"/>
+                <w:cs/>
+                <w:lang w:bidi="ta-IN"/>
+              </w:rPr>
+              <w:t>வ</w:t>
+            </w:r>
+            <w:r>
+              <w:rPr>
+                <w:rFonts w:ascii="Latha" w:hAnsi="Latha" w:cs="Latha"/>
+                <w:sz w:val="28"/>
+                <w:szCs w:val="28"/>
+                <w:highlight w:val="green"/>
+                <w:cs/>
+                <w:lang w:bidi="ta-IN"/>
+              </w:rPr>
+              <w:t>ஸ்பரி</w:t>
+            </w:r>
+            <w:r>
+              <w:rPr>
+                <w:rFonts w:ascii="BRH Tamil Tab Extra" w:hAnsi="BRH Tamil Tab Extra" w:cs="Latha"/>
+                <w:b/>
+                <w:sz w:val="36"/>
+                <w:szCs w:val="28"/>
+                <w:lang w:bidi="ta-IN"/>
+              </w:rPr>
+              <w:t>†</w:t>
+            </w:r>
+            <w:r>
+              <w:rPr>
+                <w:rFonts w:ascii="Latha" w:hAnsi="Latha" w:cs="Latha"/>
+                <w:sz w:val="28"/>
+                <w:szCs w:val="28"/>
+                <w:lang w:bidi="ta-IN"/>
+              </w:rPr>
+              <w:t xml:space="preserve"> |</w:t>
+            </w:r>
+          </w:p>
+          <w:p>
+            <w:pPr>
+              <w:widowControl w:val="0"/>
+              <w:autoSpaceDE w:val="0"/>
+              <w:autoSpaceDN w:val="0"/>
+              <w:adjustRightInd w:val="0"/>
+              <w:spacing w:before="0" w:line="240" w:lineRule="auto"/>
+              <w:rPr>
+                <w:rFonts w:ascii="Latha" w:hAnsi="Latha" w:cs="Latha"/>
+                <w:sz w:val="28"/>
+                <w:szCs w:val="28"/>
+                <w:lang w:bidi="ta-IN"/>
+              </w:rPr>
+            </w:pPr>
+          </w:p>
+          <w:p>
+            <w:pPr>
+              <w:widowControl w:val="0"/>
+              <w:autoSpaceDE w:val="0"/>
+              <w:autoSpaceDN w:val="0"/>
+              <w:adjustRightInd w:val="0"/>
+              <w:spacing w:before="0" w:line="240" w:lineRule="auto"/>
+              <w:rPr>
+                <w:rFonts w:ascii="Latha" w:hAnsi="Latha" w:cs="Latha"/>
+                <w:sz w:val="28"/>
+                <w:szCs w:val="28"/>
+                <w:cs/>
+                <w:lang w:bidi="ta-IN"/>
+              </w:rPr>
+            </w:pPr>
+          </w:p>
+        </w:tc>
+      </w:tr>
+      <w:tr>
+        <w:trPr>
+          <w:trHeight w:val="1104"/>
+        </w:trPr>
+        <w:tc>
+          <w:tcPr>
+            <w:tcW w:w="3974" w:type="dxa"/>
+          </w:tcPr>
+          <w:p>
+            <w:pPr>
+              <w:widowControl w:val="0"/>
+              <w:tabs>
+                <w:tab w:val="left" w:pos="993"/>
+              </w:tabs>
+              <w:autoSpaceDE w:val="0"/>
+              <w:autoSpaceDN w:val="0"/>
+              <w:adjustRightInd w:val="0"/>
+              <w:spacing w:before="0" w:line="240" w:lineRule="auto"/>
+              <w:ind w:right="297"/>
+              <w:rPr>
+                <w:rFonts w:cs="Arial"/>
+                <w:b/>
+                <w:color w:val="000000"/>
+                <w:sz w:val="28"/>
+                <w:szCs w:val="32"/>
+              </w:rPr>
+            </w:pPr>
+            <w:r>
+              <w:rPr>
+                <w:rFonts w:cs="Arial"/>
+                <w:b/>
+                <w:color w:val="000000"/>
+                <w:sz w:val="28"/>
+                <w:szCs w:val="32"/>
+              </w:rPr>
+              <w:lastRenderedPageBreak/>
               <w:t>T.S.</w:t>
             </w:r>
             <w:r>
@@ -1955,6 +5082,42 @@
         <w:pBdr>
           <w:bottom w:val="double" w:sz="6" w:space="1" w:color="auto"/>
         </w:pBdr>
+        <w:jc w:val="center"/>
+        <w:rPr>
+          <w:b/>
+          <w:bCs/>
+          <w:sz w:val="32"/>
+          <w:szCs w:val="32"/>
+          <w:u w:val="single"/>
+        </w:rPr>
+      </w:pPr>
+    </w:p>
+    <w:p>
+      <w:pPr>
+        <w:jc w:val="center"/>
+        <w:rPr>
+          <w:b/>
+          <w:bCs/>
+          <w:sz w:val="32"/>
+          <w:szCs w:val="32"/>
+          <w:u w:val="single"/>
+        </w:rPr>
+      </w:pPr>
+    </w:p>
+    <w:p>
+      <w:pPr>
+        <w:jc w:val="center"/>
+        <w:rPr>
+          <w:b/>
+          <w:bCs/>
+          <w:sz w:val="32"/>
+          <w:szCs w:val="32"/>
+          <w:u w:val="single"/>
+        </w:rPr>
+      </w:pPr>
+    </w:p>
+    <w:p>
+      <w:pPr>
         <w:jc w:val="center"/>
         <w:rPr>
           <w:b/>
@@ -10734,6 +13897,19 @@
         <w:bCs/>
       </w:rPr>
       <w:tab/>
+    </w:r>
+    <w:r>
+      <w:rPr>
+        <w:b/>
+        <w:bCs/>
+      </w:rPr>
+      <w:t xml:space="preserve">           </w:t>
+    </w:r>
+    <w:r>
+      <w:rPr>
+        <w:b/>
+        <w:bCs/>
+      </w:rPr>
       <w:t xml:space="preserve"> </w:t>
     </w:r>
     <w:r>
@@ -11311,7 +14487,7 @@
   <w:style w:type="paragraph" w:default="1" w:styleId="Normal">
     <w:name w:val="Normal"/>
     <w:qFormat/>
-    <w:rsid w:val="00076C05"/>
+    <w:rsid w:val="002500D6"/>
     <w:pPr>
       <w:spacing w:before="120" w:line="276" w:lineRule="auto"/>
     </w:pPr>
@@ -11421,6 +14597,18 @@
       <w:sz w:val="24"/>
       <w:szCs w:val="22"/>
       <w:lang w:bidi="ar-SA"/>
+    </w:rPr>
+  </w:style>
+  <w:style w:type="paragraph" w:styleId="NoSpacing">
+    <w:name w:val="No Spacing"/>
+    <w:uiPriority w:val="1"/>
+    <w:qFormat/>
+    <w:rsid w:val="004C23BA"/>
+    <w:rPr>
+      <w:rFonts w:ascii="Arial" w:hAnsi="Arial"/>
+      <w:sz w:val="24"/>
+      <w:szCs w:val="22"/>
+      <w:lang w:val="en-US" w:eastAsia="en-US"/>
     </w:rPr>
   </w:style>
 </w:styles>

</xml_diff>